<commit_message>
Arreglando la estructura y el diccionario de datos >:c
</commit_message>
<xml_diff>
--- a/hotel-db/documentation/diccionario_de_datos.docx
+++ b/hotel-db/documentation/diccionario_de_datos.docx
@@ -130,20 +130,6 @@
           </mc:Fallback>
         </mc:AlternateContent>
       </w:r>
-      <w:r>
-        <w:rPr>
-          <w:rFonts w:ascii="Times New Roman" w:hAnsi="Times New Roman" w:eastAsia="Times New Roman" w:cs="Times New Roman"/>
-          <w:sz w:val="24"/>
-          <w:szCs w:val="24"/>
-        </w:rPr>
-      </w:r>
-      <w:r>
-        <w:rPr>
-          <w:rFonts w:ascii="Times New Roman" w:hAnsi="Times New Roman" w:eastAsia="Times New Roman" w:cs="Times New Roman"/>
-          <w:sz w:val="24"/>
-          <w:szCs w:val="24"/>
-        </w:rPr>
-      </w:r>
     </w:p>
     <w:p>
       <w:pPr>
@@ -287,28 +273,6 @@
           <w:szCs w:val="24"/>
         </w:rPr>
       </w:pPr>
-      <w:r>
-        <w:rPr>
-          <w:rFonts w:ascii="Times New Roman" w:hAnsi="Times New Roman" w:eastAsia="Times New Roman" w:cs="Times New Roman"/>
-          <w:b/>
-          <w:color w:val="000000"/>
-          <w:sz w:val="24"/>
-          <w:szCs w:val="24"/>
-          <w:highlight w:val="none"/>
-          <w:u w:val="none"/>
-        </w:rPr>
-      </w:r>
-      <w:r>
-        <w:rPr>
-          <w:rFonts w:ascii="Times New Roman" w:hAnsi="Times New Roman" w:eastAsia="Times New Roman" w:cs="Times New Roman"/>
-          <w:b/>
-          <w:color w:val="000000"/>
-          <w:sz w:val="24"/>
-          <w:szCs w:val="24"/>
-          <w:highlight w:val="none"/>
-          <w:u w:val="none"/>
-        </w:rPr>
-      </w:r>
       <w:r>
         <w:rPr>
           <w:rFonts w:ascii="Times New Roman" w:hAnsi="Times New Roman" w:eastAsia="Times New Roman" w:cs="Times New Roman"/>
@@ -471,28 +435,6 @@
           <w:szCs w:val="24"/>
         </w:rPr>
       </w:pPr>
-      <w:r>
-        <w:rPr>
-          <w:rFonts w:ascii="Times New Roman" w:hAnsi="Times New Roman" w:eastAsia="Times New Roman" w:cs="Times New Roman"/>
-          <w:b/>
-          <w:color w:val="000000"/>
-          <w:sz w:val="24"/>
-          <w:szCs w:val="24"/>
-          <w:highlight w:val="none"/>
-          <w:u w:val="none"/>
-        </w:rPr>
-      </w:r>
-      <w:r>
-        <w:rPr>
-          <w:rFonts w:ascii="Times New Roman" w:hAnsi="Times New Roman" w:eastAsia="Times New Roman" w:cs="Times New Roman"/>
-          <w:b/>
-          <w:color w:val="000000"/>
-          <w:sz w:val="24"/>
-          <w:szCs w:val="24"/>
-          <w:highlight w:val="none"/>
-          <w:u w:val="none"/>
-        </w:rPr>
-      </w:r>
       <w:r>
         <w:rPr>
           <w:rFonts w:ascii="Times New Roman" w:hAnsi="Times New Roman" w:eastAsia="Times New Roman" w:cs="Times New Roman"/>
@@ -658,15 +600,6 @@
         </w:rPr>
         <w:t xml:space="preserve">. Descripcion de Entidades y Atributos</w:t>
       </w:r>
-      <w:r>
-        <w:rPr>
-          <w:rFonts w:ascii="Times New Roman" w:hAnsi="Times New Roman" w:eastAsia="Times New Roman" w:cs="Times New Roman"/>
-          <w:b/>
-          <w:bCs/>
-          <w:sz w:val="24"/>
-          <w:szCs w:val="24"/>
-        </w:rPr>
-      </w:r>
     </w:p>
     <w:p>
       <w:pPr>
@@ -788,7 +721,7 @@
     </w:p>
     <w:tbl>
       <w:tblPr>
-        <w:tblW w:w="10167" w:type="dxa"/>
+        <w:tblW w:w="9360" w:type="dxa"/>
         <w:tblBorders>
           <w:top w:val="single" w:color="auto" w:sz="4" w:space="0"/>
           <w:left w:val="single" w:color="auto" w:sz="4" w:space="0"/>
@@ -801,9 +734,10 @@
         <w:tblLook w:val="04A0" w:firstRow="1" w:lastRow="0" w:firstColumn="1" w:lastColumn="0" w:noHBand="0" w:noVBand="1"/>
       </w:tblPr>
       <w:tblGrid>
-        <w:gridCol w:w="2103"/>
-        <w:gridCol w:w="2409"/>
-        <w:gridCol w:w="5654"/>
+        <w:gridCol w:w="1700"/>
+        <w:gridCol w:w="1560"/>
+        <w:gridCol w:w="3200"/>
+        <w:gridCol w:w="2900"/>
       </w:tblGrid>
       <w:tr>
         <w:trPr>
@@ -823,7 +757,7 @@
               <w:right w:w="150" w:type="dxa"/>
               <w:bottom w:w="100" w:type="dxa"/>
             </w:tcMar>
-            <w:tcW w:w="2103" w:type="dxa"/>
+            <w:tcW w:w="1700" w:type="dxa"/>
             <w:vAlign w:val="center"/>
           </w:tcPr>
           <w:p>
@@ -874,7 +808,7 @@
               <w:right w:w="150" w:type="dxa"/>
               <w:bottom w:w="100" w:type="dxa"/>
             </w:tcMar>
-            <w:tcW w:w="2409" w:type="dxa"/>
+            <w:tcW w:w="1560" w:type="dxa"/>
             <w:vAlign w:val="center"/>
           </w:tcPr>
           <w:p>
@@ -925,7 +859,7 @@
               <w:right w:w="150" w:type="dxa"/>
               <w:bottom w:w="100" w:type="dxa"/>
             </w:tcMar>
-            <w:tcW w:w="5654" w:type="dxa"/>
+            <w:tcW w:w="3200" w:type="dxa"/>
             <w:vAlign w:val="center"/>
           </w:tcPr>
           <w:p>
@@ -959,6 +893,49 @@
                 <w:sz w:val="24"/>
                 <w:szCs w:val="24"/>
               </w:rPr>
+            </w:r>
+          </w:p>
+        </w:tc>
+        <w:tc>
+          <w:tcPr>
+            <w:tcBorders>
+              <w:top w:val="single" w:color="000000" w:sz="4" w:space="0"/>
+              <w:left w:val="single" w:color="000000" w:sz="4" w:space="0"/>
+              <w:bottom w:val="single" w:color="000000" w:sz="4" w:space="0"/>
+              <w:right w:val="single" w:color="000000" w:sz="4" w:space="0"/>
+            </w:tcBorders>
+            <w:tcMar>
+              <w:left w:w="150" w:type="dxa"/>
+              <w:top w:w="100" w:type="dxa"/>
+              <w:right w:w="150" w:type="dxa"/>
+              <w:bottom w:w="100" w:type="dxa"/>
+            </w:tcMar>
+            <w:tcW w:w="2900" w:type="dxa"/>
+            <w:vAlign w:val="center"/>
+          </w:tcPr>
+          <w:p>
+            <w:pPr>
+              <w:pBdr/>
+              <w:spacing w:line="240" w:lineRule="auto"/>
+              <w:ind/>
+              <w:jc w:val="center"/>
+              <w:rPr>
+                <w:rFonts w:ascii="Times New Roman" w:hAnsi="Times New Roman" w:cs="Times New Roman"/>
+                <w:color w:val="auto"/>
+                <w:sz w:val="24"/>
+                <w:szCs w:val="24"/>
+              </w:rPr>
+            </w:pPr>
+            <w:r>
+              <w:rPr>
+                <w:rFonts w:ascii="Times New Roman" w:hAnsi="Times New Roman" w:eastAsia="Times New Roman" w:cs="Times New Roman"/>
+                <w:b/>
+                <w:bCs/>
+                <w:color w:val="auto"/>
+                <w:sz w:val="24"/>
+                <w:szCs w:val="24"/>
+              </w:rPr>
+              <w:t xml:space="preserve">Restricciones</w:t>
             </w:r>
           </w:p>
         </w:tc>
@@ -981,7 +958,7 @@
               <w:right w:w="150" w:type="dxa"/>
               <w:bottom w:w="100" w:type="dxa"/>
             </w:tcMar>
-            <w:tcW w:w="2103" w:type="dxa"/>
+            <w:tcW w:w="1700" w:type="dxa"/>
             <w:vAlign w:val="center"/>
           </w:tcPr>
           <w:p>
@@ -1032,7 +1009,7 @@
               <w:right w:w="150" w:type="dxa"/>
               <w:bottom w:w="100" w:type="dxa"/>
             </w:tcMar>
-            <w:tcW w:w="2409" w:type="dxa"/>
+            <w:tcW w:w="1560" w:type="dxa"/>
             <w:vAlign w:val="center"/>
           </w:tcPr>
           <w:p>
@@ -1083,7 +1060,7 @@
               <w:right w:w="150" w:type="dxa"/>
               <w:bottom w:w="100" w:type="dxa"/>
             </w:tcMar>
-            <w:tcW w:w="5654" w:type="dxa"/>
+            <w:tcW w:w="3200" w:type="dxa"/>
             <w:vAlign w:val="center"/>
           </w:tcPr>
           <w:p>
@@ -1117,6 +1094,49 @@
                 <w:sz w:val="24"/>
                 <w:szCs w:val="24"/>
               </w:rPr>
+            </w:r>
+          </w:p>
+        </w:tc>
+        <w:tc>
+          <w:tcPr>
+            <w:tcBorders>
+              <w:top w:val="single" w:color="000000" w:sz="4" w:space="0"/>
+              <w:left w:val="single" w:color="000000" w:sz="4" w:space="0"/>
+              <w:bottom w:val="single" w:color="000000" w:sz="4" w:space="0"/>
+              <w:right w:val="single" w:color="000000" w:sz="4" w:space="0"/>
+            </w:tcBorders>
+            <w:tcMar>
+              <w:left w:w="150" w:type="dxa"/>
+              <w:top w:w="100" w:type="dxa"/>
+              <w:right w:w="150" w:type="dxa"/>
+              <w:bottom w:w="100" w:type="dxa"/>
+            </w:tcMar>
+            <w:tcW w:w="2900" w:type="dxa"/>
+            <w:vAlign w:val="center"/>
+          </w:tcPr>
+          <w:p>
+            <w:pPr>
+              <w:pBdr/>
+              <w:spacing w:line="240" w:lineRule="auto"/>
+              <w:ind/>
+              <w:jc w:val="left"/>
+              <w:rPr>
+                <w:rFonts w:ascii="Times New Roman" w:hAnsi="Times New Roman" w:cs="Times New Roman"/>
+                <w:color w:val="auto"/>
+                <w:sz w:val="24"/>
+                <w:szCs w:val="24"/>
+              </w:rPr>
+            </w:pPr>
+            <w:r>
+              <w:rPr>
+                <w:rFonts w:ascii="Times New Roman" w:hAnsi="Times New Roman" w:eastAsia="Times New Roman" w:cs="Times New Roman"/>
+                <w:b w:val="0"/>
+                <w:bCs w:val="0"/>
+                <w:color w:val="auto"/>
+                <w:sz w:val="24"/>
+                <w:szCs w:val="24"/>
+              </w:rPr>
+              <w:t xml:space="preserve">PRIMARY KEY, NOT NULL</w:t>
             </w:r>
           </w:p>
         </w:tc>
@@ -1137,7 +1157,7 @@
               <w:right w:w="150" w:type="dxa"/>
               <w:bottom w:w="100" w:type="dxa"/>
             </w:tcMar>
-            <w:tcW w:w="2103" w:type="dxa"/>
+            <w:tcW w:w="1700" w:type="dxa"/>
             <w:vAlign w:val="center"/>
           </w:tcPr>
           <w:p>
@@ -1188,7 +1208,7 @@
               <w:right w:w="150" w:type="dxa"/>
               <w:bottom w:w="100" w:type="dxa"/>
             </w:tcMar>
-            <w:tcW w:w="2409" w:type="dxa"/>
+            <w:tcW w:w="1560" w:type="dxa"/>
             <w:vAlign w:val="center"/>
           </w:tcPr>
           <w:p>
@@ -1239,7 +1259,7 @@
               <w:right w:w="150" w:type="dxa"/>
               <w:bottom w:w="100" w:type="dxa"/>
             </w:tcMar>
-            <w:tcW w:w="5654" w:type="dxa"/>
+            <w:tcW w:w="3200" w:type="dxa"/>
             <w:vAlign w:val="center"/>
           </w:tcPr>
           <w:p>
@@ -1273,6 +1293,49 @@
                 <w:sz w:val="24"/>
                 <w:szCs w:val="24"/>
               </w:rPr>
+            </w:r>
+          </w:p>
+        </w:tc>
+        <w:tc>
+          <w:tcPr>
+            <w:tcBorders>
+              <w:top w:val="single" w:color="000000" w:sz="4" w:space="0"/>
+              <w:left w:val="single" w:color="000000" w:sz="4" w:space="0"/>
+              <w:bottom w:val="single" w:color="000000" w:sz="4" w:space="0"/>
+              <w:right w:val="single" w:color="000000" w:sz="4" w:space="0"/>
+            </w:tcBorders>
+            <w:tcMar>
+              <w:left w:w="150" w:type="dxa"/>
+              <w:top w:w="100" w:type="dxa"/>
+              <w:right w:w="150" w:type="dxa"/>
+              <w:bottom w:w="100" w:type="dxa"/>
+            </w:tcMar>
+            <w:tcW w:w="2900" w:type="dxa"/>
+            <w:vAlign w:val="center"/>
+          </w:tcPr>
+          <w:p>
+            <w:pPr>
+              <w:pBdr/>
+              <w:spacing w:line="240" w:lineRule="auto"/>
+              <w:ind/>
+              <w:jc w:val="left"/>
+              <w:rPr>
+                <w:rFonts w:ascii="Times New Roman" w:hAnsi="Times New Roman" w:cs="Times New Roman"/>
+                <w:color w:val="auto"/>
+                <w:sz w:val="24"/>
+                <w:szCs w:val="24"/>
+              </w:rPr>
+            </w:pPr>
+            <w:r>
+              <w:rPr>
+                <w:rFonts w:ascii="Times New Roman" w:hAnsi="Times New Roman" w:eastAsia="Times New Roman" w:cs="Times New Roman"/>
+                <w:b w:val="0"/>
+                <w:bCs w:val="0"/>
+                <w:color w:val="auto"/>
+                <w:sz w:val="24"/>
+                <w:szCs w:val="24"/>
+              </w:rPr>
+              <w:t xml:space="preserve">NOT NULL</w:t>
             </w:r>
           </w:p>
         </w:tc>
@@ -1293,7 +1356,7 @@
               <w:right w:w="150" w:type="dxa"/>
               <w:bottom w:w="100" w:type="dxa"/>
             </w:tcMar>
-            <w:tcW w:w="2103" w:type="dxa"/>
+            <w:tcW w:w="1700" w:type="dxa"/>
             <w:vAlign w:val="center"/>
           </w:tcPr>
           <w:p>
@@ -1344,7 +1407,7 @@
               <w:right w:w="150" w:type="dxa"/>
               <w:bottom w:w="100" w:type="dxa"/>
             </w:tcMar>
-            <w:tcW w:w="2409" w:type="dxa"/>
+            <w:tcW w:w="1560" w:type="dxa"/>
             <w:vAlign w:val="center"/>
           </w:tcPr>
           <w:p>
@@ -1395,7 +1458,7 @@
               <w:right w:w="150" w:type="dxa"/>
               <w:bottom w:w="100" w:type="dxa"/>
             </w:tcMar>
-            <w:tcW w:w="5654" w:type="dxa"/>
+            <w:tcW w:w="3200" w:type="dxa"/>
             <w:vAlign w:val="center"/>
           </w:tcPr>
           <w:p>
@@ -1429,6 +1492,49 @@
                 <w:sz w:val="24"/>
                 <w:szCs w:val="24"/>
               </w:rPr>
+            </w:r>
+          </w:p>
+        </w:tc>
+        <w:tc>
+          <w:tcPr>
+            <w:tcBorders>
+              <w:top w:val="single" w:color="000000" w:sz="4" w:space="0"/>
+              <w:left w:val="single" w:color="000000" w:sz="4" w:space="0"/>
+              <w:bottom w:val="single" w:color="000000" w:sz="4" w:space="0"/>
+              <w:right w:val="single" w:color="000000" w:sz="4" w:space="0"/>
+            </w:tcBorders>
+            <w:tcMar>
+              <w:left w:w="150" w:type="dxa"/>
+              <w:top w:w="100" w:type="dxa"/>
+              <w:right w:w="150" w:type="dxa"/>
+              <w:bottom w:w="100" w:type="dxa"/>
+            </w:tcMar>
+            <w:tcW w:w="2900" w:type="dxa"/>
+            <w:vAlign w:val="center"/>
+          </w:tcPr>
+          <w:p>
+            <w:pPr>
+              <w:pBdr/>
+              <w:spacing w:line="240" w:lineRule="auto"/>
+              <w:ind/>
+              <w:jc w:val="left"/>
+              <w:rPr>
+                <w:rFonts w:ascii="Times New Roman" w:hAnsi="Times New Roman" w:cs="Times New Roman"/>
+                <w:color w:val="auto"/>
+                <w:sz w:val="24"/>
+                <w:szCs w:val="24"/>
+              </w:rPr>
+            </w:pPr>
+            <w:r>
+              <w:rPr>
+                <w:rFonts w:ascii="Times New Roman" w:hAnsi="Times New Roman" w:eastAsia="Times New Roman" w:cs="Times New Roman"/>
+                <w:b w:val="0"/>
+                <w:bCs w:val="0"/>
+                <w:color w:val="auto"/>
+                <w:sz w:val="24"/>
+                <w:szCs w:val="24"/>
+              </w:rPr>
+              <w:t xml:space="preserve">Opcional (NULL)</w:t>
             </w:r>
           </w:p>
         </w:tc>
@@ -1449,7 +1555,7 @@
               <w:right w:w="150" w:type="dxa"/>
               <w:bottom w:w="100" w:type="dxa"/>
             </w:tcMar>
-            <w:tcW w:w="2103" w:type="dxa"/>
+            <w:tcW w:w="1700" w:type="dxa"/>
             <w:vAlign w:val="center"/>
           </w:tcPr>
           <w:p>
@@ -1500,7 +1606,7 @@
               <w:right w:w="150" w:type="dxa"/>
               <w:bottom w:w="100" w:type="dxa"/>
             </w:tcMar>
-            <w:tcW w:w="2409" w:type="dxa"/>
+            <w:tcW w:w="1560" w:type="dxa"/>
             <w:vAlign w:val="center"/>
           </w:tcPr>
           <w:p>
@@ -1551,7 +1657,7 @@
               <w:right w:w="150" w:type="dxa"/>
               <w:bottom w:w="100" w:type="dxa"/>
             </w:tcMar>
-            <w:tcW w:w="5654" w:type="dxa"/>
+            <w:tcW w:w="3200" w:type="dxa"/>
             <w:vAlign w:val="center"/>
           </w:tcPr>
           <w:p>
@@ -1585,6 +1691,49 @@
                 <w:sz w:val="24"/>
                 <w:szCs w:val="24"/>
               </w:rPr>
+            </w:r>
+          </w:p>
+        </w:tc>
+        <w:tc>
+          <w:tcPr>
+            <w:tcBorders>
+              <w:top w:val="single" w:color="000000" w:sz="4" w:space="0"/>
+              <w:left w:val="single" w:color="000000" w:sz="4" w:space="0"/>
+              <w:bottom w:val="single" w:color="000000" w:sz="4" w:space="0"/>
+              <w:right w:val="single" w:color="000000" w:sz="4" w:space="0"/>
+            </w:tcBorders>
+            <w:tcMar>
+              <w:left w:w="150" w:type="dxa"/>
+              <w:top w:w="100" w:type="dxa"/>
+              <w:right w:w="150" w:type="dxa"/>
+              <w:bottom w:w="100" w:type="dxa"/>
+            </w:tcMar>
+            <w:tcW w:w="2900" w:type="dxa"/>
+            <w:vAlign w:val="center"/>
+          </w:tcPr>
+          <w:p>
+            <w:pPr>
+              <w:pBdr/>
+              <w:spacing w:line="240" w:lineRule="auto"/>
+              <w:ind/>
+              <w:jc w:val="left"/>
+              <w:rPr>
+                <w:rFonts w:ascii="Times New Roman" w:hAnsi="Times New Roman" w:cs="Times New Roman"/>
+                <w:color w:val="auto"/>
+                <w:sz w:val="24"/>
+                <w:szCs w:val="24"/>
+              </w:rPr>
+            </w:pPr>
+            <w:r>
+              <w:rPr>
+                <w:rFonts w:ascii="Times New Roman" w:hAnsi="Times New Roman" w:eastAsia="Times New Roman" w:cs="Times New Roman"/>
+                <w:b w:val="0"/>
+                <w:bCs w:val="0"/>
+                <w:color w:val="auto"/>
+                <w:sz w:val="24"/>
+                <w:szCs w:val="24"/>
+              </w:rPr>
+              <w:t xml:space="preserve">NOT NULL</w:t>
             </w:r>
           </w:p>
         </w:tc>
@@ -1605,7 +1754,7 @@
               <w:right w:w="150" w:type="dxa"/>
               <w:bottom w:w="100" w:type="dxa"/>
             </w:tcMar>
-            <w:tcW w:w="2103" w:type="dxa"/>
+            <w:tcW w:w="1700" w:type="dxa"/>
             <w:vAlign w:val="center"/>
           </w:tcPr>
           <w:p>
@@ -1656,7 +1805,7 @@
               <w:right w:w="150" w:type="dxa"/>
               <w:bottom w:w="100" w:type="dxa"/>
             </w:tcMar>
-            <w:tcW w:w="2409" w:type="dxa"/>
+            <w:tcW w:w="1560" w:type="dxa"/>
             <w:vAlign w:val="center"/>
           </w:tcPr>
           <w:p>
@@ -1707,7 +1856,7 @@
               <w:right w:w="150" w:type="dxa"/>
               <w:bottom w:w="100" w:type="dxa"/>
             </w:tcMar>
-            <w:tcW w:w="5654" w:type="dxa"/>
+            <w:tcW w:w="3200" w:type="dxa"/>
             <w:vAlign w:val="center"/>
           </w:tcPr>
           <w:p>
@@ -1741,6 +1890,49 @@
                 <w:sz w:val="24"/>
                 <w:szCs w:val="24"/>
               </w:rPr>
+            </w:r>
+          </w:p>
+        </w:tc>
+        <w:tc>
+          <w:tcPr>
+            <w:tcBorders>
+              <w:top w:val="single" w:color="000000" w:sz="4" w:space="0"/>
+              <w:left w:val="single" w:color="000000" w:sz="4" w:space="0"/>
+              <w:bottom w:val="single" w:color="000000" w:sz="4" w:space="0"/>
+              <w:right w:val="single" w:color="000000" w:sz="4" w:space="0"/>
+            </w:tcBorders>
+            <w:tcMar>
+              <w:left w:w="150" w:type="dxa"/>
+              <w:top w:w="100" w:type="dxa"/>
+              <w:right w:w="150" w:type="dxa"/>
+              <w:bottom w:w="100" w:type="dxa"/>
+            </w:tcMar>
+            <w:tcW w:w="2900" w:type="dxa"/>
+            <w:vAlign w:val="center"/>
+          </w:tcPr>
+          <w:p>
+            <w:pPr>
+              <w:pBdr/>
+              <w:spacing w:line="240" w:lineRule="auto"/>
+              <w:ind/>
+              <w:jc w:val="left"/>
+              <w:rPr>
+                <w:rFonts w:ascii="Times New Roman" w:hAnsi="Times New Roman" w:cs="Times New Roman"/>
+                <w:color w:val="auto"/>
+                <w:sz w:val="24"/>
+                <w:szCs w:val="24"/>
+              </w:rPr>
+            </w:pPr>
+            <w:r>
+              <w:rPr>
+                <w:rFonts w:ascii="Times New Roman" w:hAnsi="Times New Roman" w:eastAsia="Times New Roman" w:cs="Times New Roman"/>
+                <w:b w:val="0"/>
+                <w:bCs w:val="0"/>
+                <w:color w:val="auto"/>
+                <w:sz w:val="24"/>
+                <w:szCs w:val="24"/>
+              </w:rPr>
+              <w:t xml:space="preserve">Opcional (NULL)</w:t>
             </w:r>
           </w:p>
         </w:tc>
@@ -1761,7 +1953,7 @@
               <w:right w:w="150" w:type="dxa"/>
               <w:bottom w:w="100" w:type="dxa"/>
             </w:tcMar>
-            <w:tcW w:w="2103" w:type="dxa"/>
+            <w:tcW w:w="1700" w:type="dxa"/>
             <w:vAlign w:val="center"/>
           </w:tcPr>
           <w:p>
@@ -1812,7 +2004,7 @@
               <w:right w:w="150" w:type="dxa"/>
               <w:bottom w:w="100" w:type="dxa"/>
             </w:tcMar>
-            <w:tcW w:w="2409" w:type="dxa"/>
+            <w:tcW w:w="1560" w:type="dxa"/>
             <w:vAlign w:val="center"/>
           </w:tcPr>
           <w:p>
@@ -1863,7 +2055,7 @@
               <w:right w:w="150" w:type="dxa"/>
               <w:bottom w:w="100" w:type="dxa"/>
             </w:tcMar>
-            <w:tcW w:w="5654" w:type="dxa"/>
+            <w:tcW w:w="3200" w:type="dxa"/>
             <w:vAlign w:val="center"/>
           </w:tcPr>
           <w:p>
@@ -1897,6 +2089,49 @@
                 <w:sz w:val="24"/>
                 <w:szCs w:val="24"/>
               </w:rPr>
+            </w:r>
+          </w:p>
+        </w:tc>
+        <w:tc>
+          <w:tcPr>
+            <w:tcBorders>
+              <w:top w:val="single" w:color="000000" w:sz="4" w:space="0"/>
+              <w:left w:val="single" w:color="000000" w:sz="4" w:space="0"/>
+              <w:bottom w:val="single" w:color="000000" w:sz="4" w:space="0"/>
+              <w:right w:val="single" w:color="000000" w:sz="4" w:space="0"/>
+            </w:tcBorders>
+            <w:tcMar>
+              <w:left w:w="150" w:type="dxa"/>
+              <w:top w:w="100" w:type="dxa"/>
+              <w:right w:w="150" w:type="dxa"/>
+              <w:bottom w:w="100" w:type="dxa"/>
+            </w:tcMar>
+            <w:tcW w:w="2900" w:type="dxa"/>
+            <w:vAlign w:val="center"/>
+          </w:tcPr>
+          <w:p>
+            <w:pPr>
+              <w:pBdr/>
+              <w:spacing w:line="240" w:lineRule="auto"/>
+              <w:ind/>
+              <w:jc w:val="left"/>
+              <w:rPr>
+                <w:rFonts w:ascii="Times New Roman" w:hAnsi="Times New Roman" w:cs="Times New Roman"/>
+                <w:color w:val="auto"/>
+                <w:sz w:val="24"/>
+                <w:szCs w:val="24"/>
+              </w:rPr>
+            </w:pPr>
+            <w:r>
+              <w:rPr>
+                <w:rFonts w:ascii="Times New Roman" w:hAnsi="Times New Roman" w:eastAsia="Times New Roman" w:cs="Times New Roman"/>
+                <w:b w:val="0"/>
+                <w:bCs w:val="0"/>
+                <w:color w:val="auto"/>
+                <w:sz w:val="24"/>
+                <w:szCs w:val="24"/>
+              </w:rPr>
+              <w:t xml:space="preserve">NOT NULL, UNIQUE</w:t>
             </w:r>
           </w:p>
         </w:tc>
@@ -1917,7 +2152,7 @@
               <w:right w:w="150" w:type="dxa"/>
               <w:bottom w:w="100" w:type="dxa"/>
             </w:tcMar>
-            <w:tcW w:w="2103" w:type="dxa"/>
+            <w:tcW w:w="1700" w:type="dxa"/>
             <w:vAlign w:val="center"/>
           </w:tcPr>
           <w:p>
@@ -1968,7 +2203,7 @@
               <w:right w:w="150" w:type="dxa"/>
               <w:bottom w:w="100" w:type="dxa"/>
             </w:tcMar>
-            <w:tcW w:w="2409" w:type="dxa"/>
+            <w:tcW w:w="1560" w:type="dxa"/>
             <w:vAlign w:val="center"/>
           </w:tcPr>
           <w:p>
@@ -2019,7 +2254,7 @@
               <w:right w:w="150" w:type="dxa"/>
               <w:bottom w:w="100" w:type="dxa"/>
             </w:tcMar>
-            <w:tcW w:w="5654" w:type="dxa"/>
+            <w:tcW w:w="3200" w:type="dxa"/>
             <w:vAlign w:val="center"/>
           </w:tcPr>
           <w:p>
@@ -2053,6 +2288,49 @@
                 <w:sz w:val="24"/>
                 <w:szCs w:val="24"/>
               </w:rPr>
+            </w:r>
+          </w:p>
+        </w:tc>
+        <w:tc>
+          <w:tcPr>
+            <w:tcBorders>
+              <w:top w:val="single" w:color="000000" w:sz="4" w:space="0"/>
+              <w:left w:val="single" w:color="000000" w:sz="4" w:space="0"/>
+              <w:bottom w:val="single" w:color="000000" w:sz="4" w:space="0"/>
+              <w:right w:val="single" w:color="000000" w:sz="4" w:space="0"/>
+            </w:tcBorders>
+            <w:tcMar>
+              <w:left w:w="150" w:type="dxa"/>
+              <w:top w:w="100" w:type="dxa"/>
+              <w:right w:w="150" w:type="dxa"/>
+              <w:bottom w:w="100" w:type="dxa"/>
+            </w:tcMar>
+            <w:tcW w:w="2900" w:type="dxa"/>
+            <w:vAlign w:val="center"/>
+          </w:tcPr>
+          <w:p>
+            <w:pPr>
+              <w:pBdr/>
+              <w:spacing w:line="240" w:lineRule="auto"/>
+              <w:ind/>
+              <w:jc w:val="left"/>
+              <w:rPr>
+                <w:rFonts w:ascii="Times New Roman" w:hAnsi="Times New Roman" w:cs="Times New Roman"/>
+                <w:color w:val="auto"/>
+                <w:sz w:val="24"/>
+                <w:szCs w:val="24"/>
+              </w:rPr>
+            </w:pPr>
+            <w:r>
+              <w:rPr>
+                <w:rFonts w:ascii="Times New Roman" w:hAnsi="Times New Roman" w:eastAsia="Times New Roman" w:cs="Times New Roman"/>
+                <w:b w:val="0"/>
+                <w:bCs w:val="0"/>
+                <w:color w:val="auto"/>
+                <w:sz w:val="24"/>
+                <w:szCs w:val="24"/>
+              </w:rPr>
+              <w:t xml:space="preserve">Opcional (NULL)</w:t>
             </w:r>
           </w:p>
         </w:tc>
@@ -2073,7 +2351,7 @@
               <w:right w:w="150" w:type="dxa"/>
               <w:bottom w:w="100" w:type="dxa"/>
             </w:tcMar>
-            <w:tcW w:w="2103" w:type="dxa"/>
+            <w:tcW w:w="1700" w:type="dxa"/>
             <w:vAlign w:val="center"/>
           </w:tcPr>
           <w:p>
@@ -2124,7 +2402,7 @@
               <w:right w:w="150" w:type="dxa"/>
               <w:bottom w:w="100" w:type="dxa"/>
             </w:tcMar>
-            <w:tcW w:w="2409" w:type="dxa"/>
+            <w:tcW w:w="1560" w:type="dxa"/>
             <w:vAlign w:val="center"/>
           </w:tcPr>
           <w:p>
@@ -2175,7 +2453,7 @@
               <w:right w:w="150" w:type="dxa"/>
               <w:bottom w:w="100" w:type="dxa"/>
             </w:tcMar>
-            <w:tcW w:w="5654" w:type="dxa"/>
+            <w:tcW w:w="3200" w:type="dxa"/>
             <w:vAlign w:val="center"/>
           </w:tcPr>
           <w:p>
@@ -2209,6 +2487,49 @@
                 <w:sz w:val="24"/>
                 <w:szCs w:val="24"/>
               </w:rPr>
+            </w:r>
+          </w:p>
+        </w:tc>
+        <w:tc>
+          <w:tcPr>
+            <w:tcBorders>
+              <w:top w:val="single" w:color="000000" w:sz="4" w:space="0"/>
+              <w:left w:val="single" w:color="000000" w:sz="4" w:space="0"/>
+              <w:bottom w:val="single" w:color="000000" w:sz="4" w:space="0"/>
+              <w:right w:val="single" w:color="000000" w:sz="4" w:space="0"/>
+            </w:tcBorders>
+            <w:tcMar>
+              <w:left w:w="150" w:type="dxa"/>
+              <w:top w:w="100" w:type="dxa"/>
+              <w:right w:w="150" w:type="dxa"/>
+              <w:bottom w:w="100" w:type="dxa"/>
+            </w:tcMar>
+            <w:tcW w:w="2900" w:type="dxa"/>
+            <w:vAlign w:val="center"/>
+          </w:tcPr>
+          <w:p>
+            <w:pPr>
+              <w:pBdr/>
+              <w:spacing w:line="240" w:lineRule="auto"/>
+              <w:ind/>
+              <w:jc w:val="left"/>
+              <w:rPr>
+                <w:rFonts w:ascii="Times New Roman" w:hAnsi="Times New Roman" w:cs="Times New Roman"/>
+                <w:color w:val="auto"/>
+                <w:sz w:val="24"/>
+                <w:szCs w:val="24"/>
+              </w:rPr>
+            </w:pPr>
+            <w:r>
+              <w:rPr>
+                <w:rFonts w:ascii="Times New Roman" w:hAnsi="Times New Roman" w:eastAsia="Times New Roman" w:cs="Times New Roman"/>
+                <w:b w:val="0"/>
+                <w:bCs w:val="0"/>
+                <w:color w:val="auto"/>
+                <w:sz w:val="24"/>
+                <w:szCs w:val="24"/>
+              </w:rPr>
+              <w:t xml:space="preserve">Opcional (NULL)</w:t>
             </w:r>
           </w:p>
         </w:tc>
@@ -2229,7 +2550,7 @@
               <w:right w:w="150" w:type="dxa"/>
               <w:bottom w:w="100" w:type="dxa"/>
             </w:tcMar>
-            <w:tcW w:w="2103" w:type="dxa"/>
+            <w:tcW w:w="1700" w:type="dxa"/>
             <w:vAlign w:val="center"/>
           </w:tcPr>
           <w:p>
@@ -2280,7 +2601,7 @@
               <w:right w:w="150" w:type="dxa"/>
               <w:bottom w:w="100" w:type="dxa"/>
             </w:tcMar>
-            <w:tcW w:w="2409" w:type="dxa"/>
+            <w:tcW w:w="1560" w:type="dxa"/>
             <w:vAlign w:val="center"/>
           </w:tcPr>
           <w:p>
@@ -2331,7 +2652,7 @@
               <w:right w:w="150" w:type="dxa"/>
               <w:bottom w:w="100" w:type="dxa"/>
             </w:tcMar>
-            <w:tcW w:w="5654" w:type="dxa"/>
+            <w:tcW w:w="3200" w:type="dxa"/>
             <w:vAlign w:val="center"/>
           </w:tcPr>
           <w:p>
@@ -2365,6 +2686,49 @@
                 <w:sz w:val="24"/>
                 <w:szCs w:val="24"/>
               </w:rPr>
+            </w:r>
+          </w:p>
+        </w:tc>
+        <w:tc>
+          <w:tcPr>
+            <w:tcBorders>
+              <w:top w:val="single" w:color="000000" w:sz="4" w:space="0"/>
+              <w:left w:val="single" w:color="000000" w:sz="4" w:space="0"/>
+              <w:bottom w:val="single" w:color="000000" w:sz="4" w:space="0"/>
+              <w:right w:val="single" w:color="000000" w:sz="4" w:space="0"/>
+            </w:tcBorders>
+            <w:tcMar>
+              <w:left w:w="150" w:type="dxa"/>
+              <w:top w:w="100" w:type="dxa"/>
+              <w:right w:w="150" w:type="dxa"/>
+              <w:bottom w:w="100" w:type="dxa"/>
+            </w:tcMar>
+            <w:tcW w:w="2900" w:type="dxa"/>
+            <w:vAlign w:val="center"/>
+          </w:tcPr>
+          <w:p>
+            <w:pPr>
+              <w:pBdr/>
+              <w:spacing w:line="240" w:lineRule="auto"/>
+              <w:ind/>
+              <w:jc w:val="left"/>
+              <w:rPr>
+                <w:rFonts w:ascii="Times New Roman" w:hAnsi="Times New Roman" w:cs="Times New Roman"/>
+                <w:color w:val="auto"/>
+                <w:sz w:val="24"/>
+                <w:szCs w:val="24"/>
+              </w:rPr>
+            </w:pPr>
+            <w:r>
+              <w:rPr>
+                <w:rFonts w:ascii="Times New Roman" w:hAnsi="Times New Roman" w:eastAsia="Times New Roman" w:cs="Times New Roman"/>
+                <w:b w:val="0"/>
+                <w:bCs w:val="0"/>
+                <w:color w:val="auto"/>
+                <w:sz w:val="24"/>
+                <w:szCs w:val="24"/>
+              </w:rPr>
+              <w:t xml:space="preserve">Opcional (NULL)</w:t>
             </w:r>
           </w:p>
         </w:tc>
@@ -2386,17 +2750,6 @@
           <w:highlight w:val="none"/>
         </w:rPr>
       </w:pPr>
-      <w:r>
-        <w:rPr>
-          <w:rFonts w:ascii="Times New Roman" w:hAnsi="Times New Roman" w:eastAsia="Times New Roman" w:cs="Times New Roman"/>
-          <w:b/>
-          <w:bCs/>
-          <w:color w:val="auto"/>
-          <w:sz w:val="24"/>
-          <w:szCs w:val="24"/>
-          <w:highlight w:val="none"/>
-        </w:rPr>
-      </w:r>
       <w:r>
         <w:rPr>
           <w:rFonts w:ascii="Times New Roman" w:hAnsi="Times New Roman" w:eastAsia="Times New Roman" w:cs="Times New Roman"/>
@@ -2491,7 +2844,7 @@
     </w:p>
     <w:tbl>
       <w:tblPr>
-        <w:tblW w:w="9473" w:type="dxa"/>
+        <w:tblW w:w="9360" w:type="dxa"/>
         <w:tblBorders>
           <w:top w:val="single" w:color="auto" w:sz="4" w:space="0"/>
           <w:left w:val="single" w:color="auto" w:sz="4" w:space="0"/>
@@ -2504,9 +2857,10 @@
         <w:tblLook w:val="04A0" w:firstRow="1" w:lastRow="0" w:firstColumn="1" w:lastColumn="0" w:noHBand="0" w:noVBand="1"/>
       </w:tblPr>
       <w:tblGrid>
-        <w:gridCol w:w="1536"/>
-        <w:gridCol w:w="1984"/>
-        <w:gridCol w:w="5953"/>
+        <w:gridCol w:w="1700"/>
+        <w:gridCol w:w="1560"/>
+        <w:gridCol w:w="3200"/>
+        <w:gridCol w:w="2900"/>
       </w:tblGrid>
       <w:tr>
         <w:trPr>
@@ -2526,7 +2880,7 @@
               <w:right w:w="150" w:type="dxa"/>
               <w:bottom w:w="100" w:type="dxa"/>
             </w:tcMar>
-            <w:tcW w:w="1536" w:type="dxa"/>
+            <w:tcW w:w="1700" w:type="dxa"/>
             <w:vAlign w:val="center"/>
           </w:tcPr>
           <w:p>
@@ -2577,7 +2931,7 @@
               <w:right w:w="150" w:type="dxa"/>
               <w:bottom w:w="100" w:type="dxa"/>
             </w:tcMar>
-            <w:tcW w:w="1984" w:type="dxa"/>
+            <w:tcW w:w="1560" w:type="dxa"/>
             <w:vAlign w:val="center"/>
           </w:tcPr>
           <w:p>
@@ -2628,7 +2982,7 @@
               <w:right w:w="150" w:type="dxa"/>
               <w:bottom w:w="100" w:type="dxa"/>
             </w:tcMar>
-            <w:tcW w:w="5953" w:type="dxa"/>
+            <w:tcW w:w="3200" w:type="dxa"/>
             <w:vAlign w:val="center"/>
           </w:tcPr>
           <w:p>
@@ -2662,6 +3016,49 @@
                 <w:sz w:val="24"/>
                 <w:szCs w:val="24"/>
               </w:rPr>
+            </w:r>
+          </w:p>
+        </w:tc>
+        <w:tc>
+          <w:tcPr>
+            <w:tcBorders>
+              <w:top w:val="single" w:color="000000" w:sz="4" w:space="0"/>
+              <w:left w:val="single" w:color="000000" w:sz="4" w:space="0"/>
+              <w:bottom w:val="single" w:color="000000" w:sz="4" w:space="0"/>
+              <w:right w:val="single" w:color="000000" w:sz="4" w:space="0"/>
+            </w:tcBorders>
+            <w:tcMar>
+              <w:left w:w="150" w:type="dxa"/>
+              <w:top w:w="100" w:type="dxa"/>
+              <w:right w:w="150" w:type="dxa"/>
+              <w:bottom w:w="100" w:type="dxa"/>
+            </w:tcMar>
+            <w:tcW w:w="2900" w:type="dxa"/>
+            <w:vAlign w:val="center"/>
+          </w:tcPr>
+          <w:p>
+            <w:pPr>
+              <w:pBdr/>
+              <w:spacing w:line="240" w:lineRule="auto"/>
+              <w:ind/>
+              <w:jc w:val="center"/>
+              <w:rPr>
+                <w:rFonts w:ascii="Times New Roman" w:hAnsi="Times New Roman" w:cs="Times New Roman"/>
+                <w:color w:val="auto"/>
+                <w:sz w:val="24"/>
+                <w:szCs w:val="24"/>
+              </w:rPr>
+            </w:pPr>
+            <w:r>
+              <w:rPr>
+                <w:rFonts w:ascii="Times New Roman" w:hAnsi="Times New Roman" w:eastAsia="Times New Roman" w:cs="Times New Roman"/>
+                <w:b/>
+                <w:bCs/>
+                <w:color w:val="auto"/>
+                <w:sz w:val="24"/>
+                <w:szCs w:val="24"/>
+              </w:rPr>
+              <w:t xml:space="preserve">Restricciones</w:t>
             </w:r>
           </w:p>
         </w:tc>
@@ -2682,7 +3079,7 @@
               <w:right w:w="150" w:type="dxa"/>
               <w:bottom w:w="100" w:type="dxa"/>
             </w:tcMar>
-            <w:tcW w:w="1536" w:type="dxa"/>
+            <w:tcW w:w="1700" w:type="dxa"/>
             <w:vAlign w:val="center"/>
           </w:tcPr>
           <w:p>
@@ -2733,7 +3130,7 @@
               <w:right w:w="150" w:type="dxa"/>
               <w:bottom w:w="100" w:type="dxa"/>
             </w:tcMar>
-            <w:tcW w:w="1984" w:type="dxa"/>
+            <w:tcW w:w="1560" w:type="dxa"/>
             <w:vAlign w:val="center"/>
           </w:tcPr>
           <w:p>
@@ -2784,7 +3181,7 @@
               <w:right w:w="150" w:type="dxa"/>
               <w:bottom w:w="100" w:type="dxa"/>
             </w:tcMar>
-            <w:tcW w:w="5953" w:type="dxa"/>
+            <w:tcW w:w="3200" w:type="dxa"/>
             <w:vAlign w:val="center"/>
           </w:tcPr>
           <w:p>
@@ -2818,6 +3215,49 @@
                 <w:sz w:val="24"/>
                 <w:szCs w:val="24"/>
               </w:rPr>
+            </w:r>
+          </w:p>
+        </w:tc>
+        <w:tc>
+          <w:tcPr>
+            <w:tcBorders>
+              <w:top w:val="single" w:color="000000" w:sz="4" w:space="0"/>
+              <w:left w:val="single" w:color="000000" w:sz="4" w:space="0"/>
+              <w:bottom w:val="single" w:color="000000" w:sz="4" w:space="0"/>
+              <w:right w:val="single" w:color="000000" w:sz="4" w:space="0"/>
+            </w:tcBorders>
+            <w:tcMar>
+              <w:left w:w="150" w:type="dxa"/>
+              <w:top w:w="100" w:type="dxa"/>
+              <w:right w:w="150" w:type="dxa"/>
+              <w:bottom w:w="100" w:type="dxa"/>
+            </w:tcMar>
+            <w:tcW w:w="2900" w:type="dxa"/>
+            <w:vAlign w:val="center"/>
+          </w:tcPr>
+          <w:p>
+            <w:pPr>
+              <w:pBdr/>
+              <w:spacing w:line="240" w:lineRule="auto"/>
+              <w:ind/>
+              <w:jc w:val="left"/>
+              <w:rPr>
+                <w:rFonts w:ascii="Times New Roman" w:hAnsi="Times New Roman" w:cs="Times New Roman"/>
+                <w:color w:val="auto"/>
+                <w:sz w:val="24"/>
+                <w:szCs w:val="24"/>
+              </w:rPr>
+            </w:pPr>
+            <w:r>
+              <w:rPr>
+                <w:rFonts w:ascii="Times New Roman" w:hAnsi="Times New Roman" w:eastAsia="Times New Roman" w:cs="Times New Roman"/>
+                <w:b w:val="0"/>
+                <w:bCs w:val="0"/>
+                <w:color w:val="auto"/>
+                <w:sz w:val="24"/>
+                <w:szCs w:val="24"/>
+              </w:rPr>
+              <w:t xml:space="preserve">PRIMARY KEY, NOT NULL, AUTO_INCREMENT</w:t>
             </w:r>
           </w:p>
         </w:tc>
@@ -2838,7 +3278,7 @@
               <w:right w:w="150" w:type="dxa"/>
               <w:bottom w:w="100" w:type="dxa"/>
             </w:tcMar>
-            <w:tcW w:w="1536" w:type="dxa"/>
+            <w:tcW w:w="1700" w:type="dxa"/>
             <w:vAlign w:val="center"/>
           </w:tcPr>
           <w:p>
@@ -2889,7 +3329,7 @@
               <w:right w:w="150" w:type="dxa"/>
               <w:bottom w:w="100" w:type="dxa"/>
             </w:tcMar>
-            <w:tcW w:w="1984" w:type="dxa"/>
+            <w:tcW w:w="1560" w:type="dxa"/>
             <w:vAlign w:val="center"/>
           </w:tcPr>
           <w:p>
@@ -2940,7 +3380,7 @@
               <w:right w:w="150" w:type="dxa"/>
               <w:bottom w:w="100" w:type="dxa"/>
             </w:tcMar>
-            <w:tcW w:w="5953" w:type="dxa"/>
+            <w:tcW w:w="3200" w:type="dxa"/>
             <w:vAlign w:val="center"/>
           </w:tcPr>
           <w:p>
@@ -2974,6 +3414,49 @@
                 <w:sz w:val="24"/>
                 <w:szCs w:val="24"/>
               </w:rPr>
+            </w:r>
+          </w:p>
+        </w:tc>
+        <w:tc>
+          <w:tcPr>
+            <w:tcBorders>
+              <w:top w:val="single" w:color="000000" w:sz="4" w:space="0"/>
+              <w:left w:val="single" w:color="000000" w:sz="4" w:space="0"/>
+              <w:bottom w:val="single" w:color="000000" w:sz="4" w:space="0"/>
+              <w:right w:val="single" w:color="000000" w:sz="4" w:space="0"/>
+            </w:tcBorders>
+            <w:tcMar>
+              <w:left w:w="150" w:type="dxa"/>
+              <w:top w:w="100" w:type="dxa"/>
+              <w:right w:w="150" w:type="dxa"/>
+              <w:bottom w:w="100" w:type="dxa"/>
+            </w:tcMar>
+            <w:tcW w:w="2900" w:type="dxa"/>
+            <w:vAlign w:val="center"/>
+          </w:tcPr>
+          <w:p>
+            <w:pPr>
+              <w:pBdr/>
+              <w:spacing w:line="240" w:lineRule="auto"/>
+              <w:ind/>
+              <w:jc w:val="left"/>
+              <w:rPr>
+                <w:rFonts w:ascii="Times New Roman" w:hAnsi="Times New Roman" w:cs="Times New Roman"/>
+                <w:color w:val="auto"/>
+                <w:sz w:val="24"/>
+                <w:szCs w:val="24"/>
+              </w:rPr>
+            </w:pPr>
+            <w:r>
+              <w:rPr>
+                <w:rFonts w:ascii="Times New Roman" w:hAnsi="Times New Roman" w:eastAsia="Times New Roman" w:cs="Times New Roman"/>
+                <w:b w:val="0"/>
+                <w:bCs w:val="0"/>
+                <w:color w:val="auto"/>
+                <w:sz w:val="24"/>
+                <w:szCs w:val="24"/>
+              </w:rPr>
+              <w:t xml:space="preserve">NOT NULL, FK → persona(id_persona), ON DELETE CASCADE, ON UPDATE CASCADE</w:t>
             </w:r>
           </w:p>
         </w:tc>
@@ -2994,7 +3477,7 @@
               <w:right w:w="150" w:type="dxa"/>
               <w:bottom w:w="100" w:type="dxa"/>
             </w:tcMar>
-            <w:tcW w:w="1536" w:type="dxa"/>
+            <w:tcW w:w="1700" w:type="dxa"/>
             <w:vAlign w:val="center"/>
           </w:tcPr>
           <w:p>
@@ -3045,7 +3528,7 @@
               <w:right w:w="150" w:type="dxa"/>
               <w:bottom w:w="100" w:type="dxa"/>
             </w:tcMar>
-            <w:tcW w:w="1984" w:type="dxa"/>
+            <w:tcW w:w="1560" w:type="dxa"/>
             <w:vAlign w:val="center"/>
           </w:tcPr>
           <w:p>
@@ -3096,7 +3579,7 @@
               <w:right w:w="150" w:type="dxa"/>
               <w:bottom w:w="100" w:type="dxa"/>
             </w:tcMar>
-            <w:tcW w:w="5953" w:type="dxa"/>
+            <w:tcW w:w="3200" w:type="dxa"/>
             <w:vAlign w:val="center"/>
           </w:tcPr>
           <w:p>
@@ -3130,6 +3613,49 @@
                 <w:sz w:val="24"/>
                 <w:szCs w:val="24"/>
               </w:rPr>
+            </w:r>
+          </w:p>
+        </w:tc>
+        <w:tc>
+          <w:tcPr>
+            <w:tcBorders>
+              <w:top w:val="single" w:color="000000" w:sz="4" w:space="0"/>
+              <w:left w:val="single" w:color="000000" w:sz="4" w:space="0"/>
+              <w:bottom w:val="single" w:color="000000" w:sz="4" w:space="0"/>
+              <w:right w:val="single" w:color="000000" w:sz="4" w:space="0"/>
+            </w:tcBorders>
+            <w:tcMar>
+              <w:left w:w="150" w:type="dxa"/>
+              <w:top w:w="100" w:type="dxa"/>
+              <w:right w:w="150" w:type="dxa"/>
+              <w:bottom w:w="100" w:type="dxa"/>
+            </w:tcMar>
+            <w:tcW w:w="2900" w:type="dxa"/>
+            <w:vAlign w:val="center"/>
+          </w:tcPr>
+          <w:p>
+            <w:pPr>
+              <w:pBdr/>
+              <w:spacing w:line="240" w:lineRule="auto"/>
+              <w:ind/>
+              <w:jc w:val="left"/>
+              <w:rPr>
+                <w:rFonts w:ascii="Times New Roman" w:hAnsi="Times New Roman" w:cs="Times New Roman"/>
+                <w:color w:val="auto"/>
+                <w:sz w:val="24"/>
+                <w:szCs w:val="24"/>
+              </w:rPr>
+            </w:pPr>
+            <w:r>
+              <w:rPr>
+                <w:rFonts w:ascii="Times New Roman" w:hAnsi="Times New Roman" w:eastAsia="Times New Roman" w:cs="Times New Roman"/>
+                <w:b w:val="0"/>
+                <w:bCs w:val="0"/>
+                <w:color w:val="auto"/>
+                <w:sz w:val="24"/>
+                <w:szCs w:val="24"/>
+              </w:rPr>
+              <w:t xml:space="preserve">NOT NULL, UNIQUE (id_persona, telefono)</w:t>
             </w:r>
           </w:p>
         </w:tc>
@@ -3227,9 +3753,10 @@
         <w:tblLook w:val="04A0" w:firstRow="1" w:lastRow="0" w:firstColumn="1" w:lastColumn="0" w:noHBand="0" w:noVBand="1"/>
       </w:tblPr>
       <w:tblGrid>
-        <w:gridCol w:w="1536"/>
-        <w:gridCol w:w="1984"/>
-        <w:gridCol w:w="5839"/>
+        <w:gridCol w:w="1700"/>
+        <w:gridCol w:w="1560"/>
+        <w:gridCol w:w="3200"/>
+        <w:gridCol w:w="2900"/>
       </w:tblGrid>
       <w:tr>
         <w:trPr>
@@ -3249,7 +3776,7 @@
               <w:right w:w="150" w:type="dxa"/>
               <w:bottom w:w="100" w:type="dxa"/>
             </w:tcMar>
-            <w:tcW w:w="1536" w:type="dxa"/>
+            <w:tcW w:w="1700" w:type="dxa"/>
             <w:vAlign w:val="center"/>
           </w:tcPr>
           <w:p>
@@ -3300,7 +3827,7 @@
               <w:right w:w="150" w:type="dxa"/>
               <w:bottom w:w="100" w:type="dxa"/>
             </w:tcMar>
-            <w:tcW w:w="1984" w:type="dxa"/>
+            <w:tcW w:w="1560" w:type="dxa"/>
             <w:vAlign w:val="center"/>
           </w:tcPr>
           <w:p>
@@ -3351,7 +3878,7 @@
               <w:right w:w="150" w:type="dxa"/>
               <w:bottom w:w="100" w:type="dxa"/>
             </w:tcMar>
-            <w:tcW w:w="5839" w:type="dxa"/>
+            <w:tcW w:w="3200" w:type="dxa"/>
             <w:vAlign w:val="center"/>
           </w:tcPr>
           <w:p>
@@ -3385,6 +3912,49 @@
                 <w:sz w:val="24"/>
                 <w:szCs w:val="24"/>
               </w:rPr>
+            </w:r>
+          </w:p>
+        </w:tc>
+        <w:tc>
+          <w:tcPr>
+            <w:tcBorders>
+              <w:top w:val="single" w:color="000000" w:sz="4" w:space="0"/>
+              <w:left w:val="single" w:color="000000" w:sz="4" w:space="0"/>
+              <w:bottom w:val="single" w:color="000000" w:sz="4" w:space="0"/>
+              <w:right w:val="single" w:color="000000" w:sz="4" w:space="0"/>
+            </w:tcBorders>
+            <w:tcMar>
+              <w:left w:w="150" w:type="dxa"/>
+              <w:top w:w="100" w:type="dxa"/>
+              <w:right w:w="150" w:type="dxa"/>
+              <w:bottom w:w="100" w:type="dxa"/>
+            </w:tcMar>
+            <w:tcW w:w="2900" w:type="dxa"/>
+            <w:vAlign w:val="center"/>
+          </w:tcPr>
+          <w:p>
+            <w:pPr>
+              <w:pBdr/>
+              <w:spacing w:line="240" w:lineRule="auto"/>
+              <w:ind/>
+              <w:jc w:val="center"/>
+              <w:rPr>
+                <w:rFonts w:ascii="Times New Roman" w:hAnsi="Times New Roman" w:cs="Times New Roman"/>
+                <w:color w:val="auto"/>
+                <w:sz w:val="24"/>
+                <w:szCs w:val="24"/>
+              </w:rPr>
+            </w:pPr>
+            <w:r>
+              <w:rPr>
+                <w:rFonts w:ascii="Times New Roman" w:hAnsi="Times New Roman" w:eastAsia="Times New Roman" w:cs="Times New Roman"/>
+                <w:b/>
+                <w:bCs/>
+                <w:color w:val="auto"/>
+                <w:sz w:val="24"/>
+                <w:szCs w:val="24"/>
+              </w:rPr>
+              <w:t xml:space="preserve">Restricciones</w:t>
             </w:r>
           </w:p>
         </w:tc>
@@ -3405,7 +3975,7 @@
               <w:right w:w="150" w:type="dxa"/>
               <w:bottom w:w="100" w:type="dxa"/>
             </w:tcMar>
-            <w:tcW w:w="1536" w:type="dxa"/>
+            <w:tcW w:w="1700" w:type="dxa"/>
             <w:vAlign w:val="center"/>
           </w:tcPr>
           <w:p>
@@ -3456,7 +4026,7 @@
               <w:right w:w="150" w:type="dxa"/>
               <w:bottom w:w="100" w:type="dxa"/>
             </w:tcMar>
-            <w:tcW w:w="1984" w:type="dxa"/>
+            <w:tcW w:w="1560" w:type="dxa"/>
             <w:vAlign w:val="center"/>
           </w:tcPr>
           <w:p>
@@ -3507,7 +4077,7 @@
               <w:right w:w="150" w:type="dxa"/>
               <w:bottom w:w="100" w:type="dxa"/>
             </w:tcMar>
-            <w:tcW w:w="5839" w:type="dxa"/>
+            <w:tcW w:w="3200" w:type="dxa"/>
             <w:vAlign w:val="center"/>
           </w:tcPr>
           <w:p>
@@ -3541,6 +4111,49 @@
                 <w:sz w:val="24"/>
                 <w:szCs w:val="24"/>
               </w:rPr>
+            </w:r>
+          </w:p>
+        </w:tc>
+        <w:tc>
+          <w:tcPr>
+            <w:tcBorders>
+              <w:top w:val="single" w:color="000000" w:sz="4" w:space="0"/>
+              <w:left w:val="single" w:color="000000" w:sz="4" w:space="0"/>
+              <w:bottom w:val="single" w:color="000000" w:sz="4" w:space="0"/>
+              <w:right w:val="single" w:color="000000" w:sz="4" w:space="0"/>
+            </w:tcBorders>
+            <w:tcMar>
+              <w:left w:w="150" w:type="dxa"/>
+              <w:top w:w="100" w:type="dxa"/>
+              <w:right w:w="150" w:type="dxa"/>
+              <w:bottom w:w="100" w:type="dxa"/>
+            </w:tcMar>
+            <w:tcW w:w="2900" w:type="dxa"/>
+            <w:vAlign w:val="center"/>
+          </w:tcPr>
+          <w:p>
+            <w:pPr>
+              <w:pBdr/>
+              <w:spacing w:line="240" w:lineRule="auto"/>
+              <w:ind/>
+              <w:jc w:val="left"/>
+              <w:rPr>
+                <w:rFonts w:ascii="Times New Roman" w:hAnsi="Times New Roman" w:cs="Times New Roman"/>
+                <w:color w:val="auto"/>
+                <w:sz w:val="24"/>
+                <w:szCs w:val="24"/>
+              </w:rPr>
+            </w:pPr>
+            <w:r>
+              <w:rPr>
+                <w:rFonts w:ascii="Times New Roman" w:hAnsi="Times New Roman" w:eastAsia="Times New Roman" w:cs="Times New Roman"/>
+                <w:b w:val="0"/>
+                <w:bCs w:val="0"/>
+                <w:color w:val="auto"/>
+                <w:sz w:val="24"/>
+                <w:szCs w:val="24"/>
+              </w:rPr>
+              <w:t xml:space="preserve">PRIMARY KEY, NOT NULL</w:t>
             </w:r>
           </w:p>
         </w:tc>
@@ -3561,7 +4174,7 @@
               <w:right w:w="150" w:type="dxa"/>
               <w:bottom w:w="100" w:type="dxa"/>
             </w:tcMar>
-            <w:tcW w:w="1536" w:type="dxa"/>
+            <w:tcW w:w="1700" w:type="dxa"/>
             <w:vAlign w:val="center"/>
           </w:tcPr>
           <w:p>
@@ -3612,7 +4225,7 @@
               <w:right w:w="150" w:type="dxa"/>
               <w:bottom w:w="100" w:type="dxa"/>
             </w:tcMar>
-            <w:tcW w:w="1984" w:type="dxa"/>
+            <w:tcW w:w="1560" w:type="dxa"/>
             <w:vAlign w:val="center"/>
           </w:tcPr>
           <w:p>
@@ -3663,7 +4276,7 @@
               <w:right w:w="150" w:type="dxa"/>
               <w:bottom w:w="100" w:type="dxa"/>
             </w:tcMar>
-            <w:tcW w:w="5839" w:type="dxa"/>
+            <w:tcW w:w="3200" w:type="dxa"/>
             <w:vAlign w:val="center"/>
           </w:tcPr>
           <w:p>
@@ -3697,6 +4310,49 @@
                 <w:sz w:val="24"/>
                 <w:szCs w:val="24"/>
               </w:rPr>
+            </w:r>
+          </w:p>
+        </w:tc>
+        <w:tc>
+          <w:tcPr>
+            <w:tcBorders>
+              <w:top w:val="single" w:color="000000" w:sz="4" w:space="0"/>
+              <w:left w:val="single" w:color="000000" w:sz="4" w:space="0"/>
+              <w:bottom w:val="single" w:color="000000" w:sz="4" w:space="0"/>
+              <w:right w:val="single" w:color="000000" w:sz="4" w:space="0"/>
+            </w:tcBorders>
+            <w:tcMar>
+              <w:left w:w="150" w:type="dxa"/>
+              <w:top w:w="100" w:type="dxa"/>
+              <w:right w:w="150" w:type="dxa"/>
+              <w:bottom w:w="100" w:type="dxa"/>
+            </w:tcMar>
+            <w:tcW w:w="2900" w:type="dxa"/>
+            <w:vAlign w:val="center"/>
+          </w:tcPr>
+          <w:p>
+            <w:pPr>
+              <w:pBdr/>
+              <w:spacing w:line="240" w:lineRule="auto"/>
+              <w:ind/>
+              <w:jc w:val="left"/>
+              <w:rPr>
+                <w:rFonts w:ascii="Times New Roman" w:hAnsi="Times New Roman" w:cs="Times New Roman"/>
+                <w:color w:val="auto"/>
+                <w:sz w:val="24"/>
+                <w:szCs w:val="24"/>
+              </w:rPr>
+            </w:pPr>
+            <w:r>
+              <w:rPr>
+                <w:rFonts w:ascii="Times New Roman" w:hAnsi="Times New Roman" w:eastAsia="Times New Roman" w:cs="Times New Roman"/>
+                <w:b w:val="0"/>
+                <w:bCs w:val="0"/>
+                <w:color w:val="auto"/>
+                <w:sz w:val="24"/>
+                <w:szCs w:val="24"/>
+              </w:rPr>
+              <w:t xml:space="preserve">NOT NULL, UNIQUE, FK → persona(id_persona), ON DELETE CASCADE, ON UPDATE CASCADE</w:t>
             </w:r>
           </w:p>
         </w:tc>
@@ -3717,28 +4373,6 @@
           <w:highlight w:val="none"/>
         </w:rPr>
       </w:pPr>
-      <w:r>
-        <w:rPr>
-          <w:rFonts w:ascii="Times New Roman" w:hAnsi="Times New Roman" w:eastAsia="Times New Roman" w:cs="Times New Roman"/>
-          <w:b/>
-          <w:bCs/>
-          <w:color w:val="auto"/>
-          <w:sz w:val="24"/>
-          <w:szCs w:val="24"/>
-          <w:highlight w:val="none"/>
-        </w:rPr>
-      </w:r>
-      <w:r>
-        <w:rPr>
-          <w:rFonts w:ascii="Times New Roman" w:hAnsi="Times New Roman" w:eastAsia="Times New Roman" w:cs="Times New Roman"/>
-          <w:b/>
-          <w:bCs/>
-          <w:color w:val="auto"/>
-          <w:sz w:val="24"/>
-          <w:szCs w:val="24"/>
-          <w:highlight w:val="none"/>
-        </w:rPr>
-      </w:r>
       <w:r>
         <w:rPr>
           <w:rFonts w:ascii="Times New Roman" w:hAnsi="Times New Roman" w:eastAsia="Times New Roman" w:cs="Times New Roman"/>
@@ -3833,7 +4467,7 @@
     </w:p>
     <w:tbl>
       <w:tblPr>
-        <w:tblW w:w="9473" w:type="dxa"/>
+        <w:tblW w:w="9360" w:type="dxa"/>
         <w:tblBorders>
           <w:top w:val="single" w:color="auto" w:sz="4" w:space="0"/>
           <w:left w:val="single" w:color="auto" w:sz="4" w:space="0"/>
@@ -3846,9 +4480,10 @@
         <w:tblLook w:val="04A0" w:firstRow="1" w:lastRow="0" w:firstColumn="1" w:lastColumn="0" w:noHBand="0" w:noVBand="1"/>
       </w:tblPr>
       <w:tblGrid>
-        <w:gridCol w:w="1678"/>
-        <w:gridCol w:w="1984"/>
-        <w:gridCol w:w="5811"/>
+        <w:gridCol w:w="1700"/>
+        <w:gridCol w:w="1560"/>
+        <w:gridCol w:w="3200"/>
+        <w:gridCol w:w="2900"/>
       </w:tblGrid>
       <w:tr>
         <w:trPr>
@@ -3869,7 +4504,7 @@
               <w:right w:w="150" w:type="dxa"/>
               <w:bottom w:w="100" w:type="dxa"/>
             </w:tcMar>
-            <w:tcW w:w="1678" w:type="dxa"/>
+            <w:tcW w:w="1700" w:type="dxa"/>
             <w:vAlign w:val="center"/>
           </w:tcPr>
           <w:p>
@@ -3920,7 +4555,7 @@
               <w:right w:w="150" w:type="dxa"/>
               <w:bottom w:w="100" w:type="dxa"/>
             </w:tcMar>
-            <w:tcW w:w="1984" w:type="dxa"/>
+            <w:tcW w:w="1560" w:type="dxa"/>
             <w:vAlign w:val="center"/>
           </w:tcPr>
           <w:p>
@@ -3971,7 +4606,7 @@
               <w:right w:w="150" w:type="dxa"/>
               <w:bottom w:w="100" w:type="dxa"/>
             </w:tcMar>
-            <w:tcW w:w="5811" w:type="dxa"/>
+            <w:tcW w:w="3200" w:type="dxa"/>
             <w:vAlign w:val="center"/>
           </w:tcPr>
           <w:p>
@@ -4005,6 +4640,49 @@
                 <w:sz w:val="24"/>
                 <w:szCs w:val="24"/>
               </w:rPr>
+            </w:r>
+          </w:p>
+        </w:tc>
+        <w:tc>
+          <w:tcPr>
+            <w:tcBorders>
+              <w:top w:val="single" w:color="000000" w:sz="4" w:space="0"/>
+              <w:left w:val="single" w:color="000000" w:sz="4" w:space="0"/>
+              <w:bottom w:val="single" w:color="000000" w:sz="4" w:space="0"/>
+              <w:right w:val="single" w:color="000000" w:sz="4" w:space="0"/>
+            </w:tcBorders>
+            <w:tcMar>
+              <w:left w:w="150" w:type="dxa"/>
+              <w:top w:w="100" w:type="dxa"/>
+              <w:right w:w="150" w:type="dxa"/>
+              <w:bottom w:w="100" w:type="dxa"/>
+            </w:tcMar>
+            <w:tcW w:w="2900" w:type="dxa"/>
+            <w:vAlign w:val="center"/>
+          </w:tcPr>
+          <w:p>
+            <w:pPr>
+              <w:pBdr/>
+              <w:spacing w:line="240" w:lineRule="auto"/>
+              <w:ind/>
+              <w:jc w:val="center"/>
+              <w:rPr>
+                <w:rFonts w:ascii="Times New Roman" w:hAnsi="Times New Roman" w:cs="Times New Roman"/>
+                <w:color w:val="auto"/>
+                <w:sz w:val="24"/>
+                <w:szCs w:val="24"/>
+              </w:rPr>
+            </w:pPr>
+            <w:r>
+              <w:rPr>
+                <w:rFonts w:ascii="Times New Roman" w:hAnsi="Times New Roman" w:eastAsia="Times New Roman" w:cs="Times New Roman"/>
+                <w:b/>
+                <w:bCs/>
+                <w:color w:val="auto"/>
+                <w:sz w:val="24"/>
+                <w:szCs w:val="24"/>
+              </w:rPr>
+              <w:t xml:space="preserve">Restricciones</w:t>
             </w:r>
           </w:p>
         </w:tc>
@@ -4025,7 +4703,7 @@
               <w:right w:w="150" w:type="dxa"/>
               <w:bottom w:w="100" w:type="dxa"/>
             </w:tcMar>
-            <w:tcW w:w="1678" w:type="dxa"/>
+            <w:tcW w:w="1700" w:type="dxa"/>
             <w:vAlign w:val="center"/>
           </w:tcPr>
           <w:p>
@@ -4076,7 +4754,7 @@
               <w:right w:w="150" w:type="dxa"/>
               <w:bottom w:w="100" w:type="dxa"/>
             </w:tcMar>
-            <w:tcW w:w="1984" w:type="dxa"/>
+            <w:tcW w:w="1560" w:type="dxa"/>
             <w:vAlign w:val="center"/>
           </w:tcPr>
           <w:p>
@@ -4127,7 +4805,7 @@
               <w:right w:w="150" w:type="dxa"/>
               <w:bottom w:w="100" w:type="dxa"/>
             </w:tcMar>
-            <w:tcW w:w="5811" w:type="dxa"/>
+            <w:tcW w:w="3200" w:type="dxa"/>
             <w:vAlign w:val="center"/>
           </w:tcPr>
           <w:p>
@@ -4161,6 +4839,49 @@
                 <w:sz w:val="24"/>
                 <w:szCs w:val="24"/>
               </w:rPr>
+            </w:r>
+          </w:p>
+        </w:tc>
+        <w:tc>
+          <w:tcPr>
+            <w:tcBorders>
+              <w:top w:val="single" w:color="000000" w:sz="4" w:space="0"/>
+              <w:left w:val="single" w:color="000000" w:sz="4" w:space="0"/>
+              <w:bottom w:val="single" w:color="000000" w:sz="4" w:space="0"/>
+              <w:right w:val="single" w:color="000000" w:sz="4" w:space="0"/>
+            </w:tcBorders>
+            <w:tcMar>
+              <w:left w:w="150" w:type="dxa"/>
+              <w:top w:w="100" w:type="dxa"/>
+              <w:right w:w="150" w:type="dxa"/>
+              <w:bottom w:w="100" w:type="dxa"/>
+            </w:tcMar>
+            <w:tcW w:w="2900" w:type="dxa"/>
+            <w:vAlign w:val="center"/>
+          </w:tcPr>
+          <w:p>
+            <w:pPr>
+              <w:pBdr/>
+              <w:spacing w:line="240" w:lineRule="auto"/>
+              <w:ind/>
+              <w:jc w:val="left"/>
+              <w:rPr>
+                <w:rFonts w:ascii="Times New Roman" w:hAnsi="Times New Roman" w:cs="Times New Roman"/>
+                <w:color w:val="auto"/>
+                <w:sz w:val="24"/>
+                <w:szCs w:val="24"/>
+              </w:rPr>
+            </w:pPr>
+            <w:r>
+              <w:rPr>
+                <w:rFonts w:ascii="Times New Roman" w:hAnsi="Times New Roman" w:eastAsia="Times New Roman" w:cs="Times New Roman"/>
+                <w:b w:val="0"/>
+                <w:bCs w:val="0"/>
+                <w:color w:val="auto"/>
+                <w:sz w:val="24"/>
+                <w:szCs w:val="24"/>
+              </w:rPr>
+              <w:t xml:space="preserve">PRIMARY KEY, NOT NULL</w:t>
             </w:r>
           </w:p>
         </w:tc>
@@ -4181,7 +4902,7 @@
               <w:right w:w="150" w:type="dxa"/>
               <w:bottom w:w="100" w:type="dxa"/>
             </w:tcMar>
-            <w:tcW w:w="1678" w:type="dxa"/>
+            <w:tcW w:w="1700" w:type="dxa"/>
             <w:vAlign w:val="center"/>
           </w:tcPr>
           <w:p>
@@ -4232,7 +4953,7 @@
               <w:right w:w="150" w:type="dxa"/>
               <w:bottom w:w="100" w:type="dxa"/>
             </w:tcMar>
-            <w:tcW w:w="1984" w:type="dxa"/>
+            <w:tcW w:w="1560" w:type="dxa"/>
             <w:vAlign w:val="center"/>
           </w:tcPr>
           <w:p>
@@ -4283,7 +5004,7 @@
               <w:right w:w="150" w:type="dxa"/>
               <w:bottom w:w="100" w:type="dxa"/>
             </w:tcMar>
-            <w:tcW w:w="5811" w:type="dxa"/>
+            <w:tcW w:w="3200" w:type="dxa"/>
             <w:vAlign w:val="center"/>
           </w:tcPr>
           <w:p>
@@ -4317,6 +5038,49 @@
                 <w:sz w:val="24"/>
                 <w:szCs w:val="24"/>
               </w:rPr>
+            </w:r>
+          </w:p>
+        </w:tc>
+        <w:tc>
+          <w:tcPr>
+            <w:tcBorders>
+              <w:top w:val="single" w:color="000000" w:sz="4" w:space="0"/>
+              <w:left w:val="single" w:color="000000" w:sz="4" w:space="0"/>
+              <w:bottom w:val="single" w:color="000000" w:sz="4" w:space="0"/>
+              <w:right w:val="single" w:color="000000" w:sz="4" w:space="0"/>
+            </w:tcBorders>
+            <w:tcMar>
+              <w:left w:w="150" w:type="dxa"/>
+              <w:top w:w="100" w:type="dxa"/>
+              <w:right w:w="150" w:type="dxa"/>
+              <w:bottom w:w="100" w:type="dxa"/>
+            </w:tcMar>
+            <w:tcW w:w="2900" w:type="dxa"/>
+            <w:vAlign w:val="center"/>
+          </w:tcPr>
+          <w:p>
+            <w:pPr>
+              <w:pBdr/>
+              <w:spacing w:line="240" w:lineRule="auto"/>
+              <w:ind/>
+              <w:jc w:val="left"/>
+              <w:rPr>
+                <w:rFonts w:ascii="Times New Roman" w:hAnsi="Times New Roman" w:cs="Times New Roman"/>
+                <w:color w:val="auto"/>
+                <w:sz w:val="24"/>
+                <w:szCs w:val="24"/>
+              </w:rPr>
+            </w:pPr>
+            <w:r>
+              <w:rPr>
+                <w:rFonts w:ascii="Times New Roman" w:hAnsi="Times New Roman" w:eastAsia="Times New Roman" w:cs="Times New Roman"/>
+                <w:b w:val="0"/>
+                <w:bCs w:val="0"/>
+                <w:color w:val="auto"/>
+                <w:sz w:val="24"/>
+                <w:szCs w:val="24"/>
+              </w:rPr>
+              <w:t xml:space="preserve">NOT NULL, UNIQUE, FK → persona(id_persona), ON DELETE CASCADE, ON UPDATE CASCADE</w:t>
             </w:r>
           </w:p>
         </w:tc>
@@ -4337,7 +5101,7 @@
               <w:right w:w="150" w:type="dxa"/>
               <w:bottom w:w="100" w:type="dxa"/>
             </w:tcMar>
-            <w:tcW w:w="1678" w:type="dxa"/>
+            <w:tcW w:w="1700" w:type="dxa"/>
             <w:vAlign w:val="center"/>
           </w:tcPr>
           <w:p>
@@ -4388,7 +5152,7 @@
               <w:right w:w="150" w:type="dxa"/>
               <w:bottom w:w="100" w:type="dxa"/>
             </w:tcMar>
-            <w:tcW w:w="1984" w:type="dxa"/>
+            <w:tcW w:w="1560" w:type="dxa"/>
             <w:vAlign w:val="center"/>
           </w:tcPr>
           <w:p>
@@ -4439,7 +5203,7 @@
               <w:right w:w="150" w:type="dxa"/>
               <w:bottom w:w="100" w:type="dxa"/>
             </w:tcMar>
-            <w:tcW w:w="5811" w:type="dxa"/>
+            <w:tcW w:w="3200" w:type="dxa"/>
             <w:vAlign w:val="center"/>
           </w:tcPr>
           <w:p>
@@ -4473,6 +5237,49 @@
                 <w:sz w:val="24"/>
                 <w:szCs w:val="24"/>
               </w:rPr>
+            </w:r>
+          </w:p>
+        </w:tc>
+        <w:tc>
+          <w:tcPr>
+            <w:tcBorders>
+              <w:top w:val="single" w:color="000000" w:sz="4" w:space="0"/>
+              <w:left w:val="single" w:color="000000" w:sz="4" w:space="0"/>
+              <w:bottom w:val="single" w:color="000000" w:sz="4" w:space="0"/>
+              <w:right w:val="single" w:color="000000" w:sz="4" w:space="0"/>
+            </w:tcBorders>
+            <w:tcMar>
+              <w:left w:w="150" w:type="dxa"/>
+              <w:top w:w="100" w:type="dxa"/>
+              <w:right w:w="150" w:type="dxa"/>
+              <w:bottom w:w="100" w:type="dxa"/>
+            </w:tcMar>
+            <w:tcW w:w="2900" w:type="dxa"/>
+            <w:vAlign w:val="center"/>
+          </w:tcPr>
+          <w:p>
+            <w:pPr>
+              <w:pBdr/>
+              <w:spacing w:line="240" w:lineRule="auto"/>
+              <w:ind/>
+              <w:jc w:val="left"/>
+              <w:rPr>
+                <w:rFonts w:ascii="Times New Roman" w:hAnsi="Times New Roman" w:cs="Times New Roman"/>
+                <w:color w:val="auto"/>
+                <w:sz w:val="24"/>
+                <w:szCs w:val="24"/>
+              </w:rPr>
+            </w:pPr>
+            <w:r>
+              <w:rPr>
+                <w:rFonts w:ascii="Times New Roman" w:hAnsi="Times New Roman" w:eastAsia="Times New Roman" w:cs="Times New Roman"/>
+                <w:b w:val="0"/>
+                <w:bCs w:val="0"/>
+                <w:color w:val="auto"/>
+                <w:sz w:val="24"/>
+                <w:szCs w:val="24"/>
+              </w:rPr>
+              <w:t xml:space="preserve">NOT NULL</w:t>
             </w:r>
           </w:p>
         </w:tc>
@@ -4493,7 +5300,7 @@
               <w:right w:w="150" w:type="dxa"/>
               <w:bottom w:w="100" w:type="dxa"/>
             </w:tcMar>
-            <w:tcW w:w="1678" w:type="dxa"/>
+            <w:tcW w:w="1700" w:type="dxa"/>
             <w:vAlign w:val="center"/>
           </w:tcPr>
           <w:p>
@@ -4544,7 +5351,7 @@
               <w:right w:w="150" w:type="dxa"/>
               <w:bottom w:w="100" w:type="dxa"/>
             </w:tcMar>
-            <w:tcW w:w="1984" w:type="dxa"/>
+            <w:tcW w:w="1560" w:type="dxa"/>
             <w:vAlign w:val="center"/>
           </w:tcPr>
           <w:p>
@@ -4595,7 +5402,7 @@
               <w:right w:w="150" w:type="dxa"/>
               <w:bottom w:w="100" w:type="dxa"/>
             </w:tcMar>
-            <w:tcW w:w="5811" w:type="dxa"/>
+            <w:tcW w:w="3200" w:type="dxa"/>
             <w:vAlign w:val="center"/>
           </w:tcPr>
           <w:p>
@@ -4632,6 +5439,49 @@
             </w:r>
           </w:p>
         </w:tc>
+        <w:tc>
+          <w:tcPr>
+            <w:tcBorders>
+              <w:top w:val="single" w:color="000000" w:sz="4" w:space="0"/>
+              <w:left w:val="single" w:color="000000" w:sz="4" w:space="0"/>
+              <w:bottom w:val="single" w:color="000000" w:sz="4" w:space="0"/>
+              <w:right w:val="single" w:color="000000" w:sz="4" w:space="0"/>
+            </w:tcBorders>
+            <w:tcMar>
+              <w:left w:w="150" w:type="dxa"/>
+              <w:top w:w="100" w:type="dxa"/>
+              <w:right w:w="150" w:type="dxa"/>
+              <w:bottom w:w="100" w:type="dxa"/>
+            </w:tcMar>
+            <w:tcW w:w="2900" w:type="dxa"/>
+            <w:vAlign w:val="center"/>
+          </w:tcPr>
+          <w:p>
+            <w:pPr>
+              <w:pBdr/>
+              <w:spacing w:line="240" w:lineRule="auto"/>
+              <w:ind/>
+              <w:jc w:val="left"/>
+              <w:rPr>
+                <w:rFonts w:ascii="Times New Roman" w:hAnsi="Times New Roman" w:cs="Times New Roman"/>
+                <w:color w:val="auto"/>
+                <w:sz w:val="24"/>
+                <w:szCs w:val="24"/>
+              </w:rPr>
+            </w:pPr>
+            <w:r>
+              <w:rPr>
+                <w:rFonts w:ascii="Times New Roman" w:hAnsi="Times New Roman" w:eastAsia="Times New Roman" w:cs="Times New Roman"/>
+                <w:b w:val="0"/>
+                <w:bCs w:val="0"/>
+                <w:color w:val="auto"/>
+                <w:sz w:val="24"/>
+                <w:szCs w:val="24"/>
+              </w:rPr>
+              <w:t xml:space="preserve">NOT NULL</w:t>
+            </w:r>
+          </w:p>
+        </w:tc>
       </w:tr>
     </w:tbl>
     <w:p>
@@ -4646,14 +5496,6 @@
           <w:szCs w:val="24"/>
         </w:rPr>
       </w:pPr>
-      <w:r>
-        <w:rPr>
-          <w:rFonts w:ascii="Times New Roman" w:hAnsi="Times New Roman" w:eastAsia="Times New Roman" w:cs="Times New Roman"/>
-          <w:color w:val="auto"/>
-          <w:sz w:val="24"/>
-          <w:szCs w:val="24"/>
-        </w:rPr>
-      </w:r>
       <w:r>
         <w:rPr>
           <w:rFonts w:ascii="Times New Roman" w:hAnsi="Times New Roman" w:eastAsia="Times New Roman" w:cs="Times New Roman"/>
@@ -4755,9 +5597,10 @@
         <w:tblLook w:val="04A0" w:firstRow="1" w:lastRow="0" w:firstColumn="1" w:lastColumn="0" w:noHBand="0" w:noVBand="1"/>
       </w:tblPr>
       <w:tblGrid>
-        <w:gridCol w:w="1395"/>
-        <w:gridCol w:w="1984"/>
-        <w:gridCol w:w="5981"/>
+        <w:gridCol w:w="1700"/>
+        <w:gridCol w:w="1560"/>
+        <w:gridCol w:w="3200"/>
+        <w:gridCol w:w="2900"/>
       </w:tblGrid>
       <w:tr>
         <w:trPr>
@@ -4777,7 +5620,7 @@
               <w:right w:w="150" w:type="dxa"/>
               <w:bottom w:w="100" w:type="dxa"/>
             </w:tcMar>
-            <w:tcW w:w="1395" w:type="dxa"/>
+            <w:tcW w:w="1700" w:type="dxa"/>
             <w:vAlign w:val="center"/>
           </w:tcPr>
           <w:p>
@@ -4828,7 +5671,7 @@
               <w:right w:w="150" w:type="dxa"/>
               <w:bottom w:w="100" w:type="dxa"/>
             </w:tcMar>
-            <w:tcW w:w="1984" w:type="dxa"/>
+            <w:tcW w:w="1560" w:type="dxa"/>
             <w:vAlign w:val="center"/>
           </w:tcPr>
           <w:p>
@@ -4879,7 +5722,7 @@
               <w:right w:w="150" w:type="dxa"/>
               <w:bottom w:w="100" w:type="dxa"/>
             </w:tcMar>
-            <w:tcW w:w="5981" w:type="dxa"/>
+            <w:tcW w:w="3200" w:type="dxa"/>
             <w:vAlign w:val="center"/>
           </w:tcPr>
           <w:p>
@@ -4913,6 +5756,49 @@
                 <w:sz w:val="24"/>
                 <w:szCs w:val="24"/>
               </w:rPr>
+            </w:r>
+          </w:p>
+        </w:tc>
+        <w:tc>
+          <w:tcPr>
+            <w:tcBorders>
+              <w:top w:val="single" w:color="000000" w:sz="4" w:space="0"/>
+              <w:left w:val="single" w:color="000000" w:sz="4" w:space="0"/>
+              <w:bottom w:val="single" w:color="000000" w:sz="4" w:space="0"/>
+              <w:right w:val="single" w:color="000000" w:sz="4" w:space="0"/>
+            </w:tcBorders>
+            <w:tcMar>
+              <w:left w:w="150" w:type="dxa"/>
+              <w:top w:w="100" w:type="dxa"/>
+              <w:right w:w="150" w:type="dxa"/>
+              <w:bottom w:w="100" w:type="dxa"/>
+            </w:tcMar>
+            <w:tcW w:w="2900" w:type="dxa"/>
+            <w:vAlign w:val="center"/>
+          </w:tcPr>
+          <w:p>
+            <w:pPr>
+              <w:pBdr/>
+              <w:spacing w:line="240" w:lineRule="auto"/>
+              <w:ind/>
+              <w:jc w:val="center"/>
+              <w:rPr>
+                <w:rFonts w:ascii="Times New Roman" w:hAnsi="Times New Roman" w:cs="Times New Roman"/>
+                <w:color w:val="auto"/>
+                <w:sz w:val="24"/>
+                <w:szCs w:val="24"/>
+              </w:rPr>
+            </w:pPr>
+            <w:r>
+              <w:rPr>
+                <w:rFonts w:ascii="Times New Roman" w:hAnsi="Times New Roman" w:eastAsia="Times New Roman" w:cs="Times New Roman"/>
+                <w:b/>
+                <w:bCs/>
+                <w:color w:val="auto"/>
+                <w:sz w:val="24"/>
+                <w:szCs w:val="24"/>
+              </w:rPr>
+              <w:t xml:space="preserve">Restricciones</w:t>
             </w:r>
           </w:p>
         </w:tc>
@@ -4933,7 +5819,7 @@
               <w:right w:w="150" w:type="dxa"/>
               <w:bottom w:w="100" w:type="dxa"/>
             </w:tcMar>
-            <w:tcW w:w="1395" w:type="dxa"/>
+            <w:tcW w:w="1700" w:type="dxa"/>
             <w:vAlign w:val="center"/>
           </w:tcPr>
           <w:p>
@@ -4984,7 +5870,7 @@
               <w:right w:w="150" w:type="dxa"/>
               <w:bottom w:w="100" w:type="dxa"/>
             </w:tcMar>
-            <w:tcW w:w="1984" w:type="dxa"/>
+            <w:tcW w:w="1560" w:type="dxa"/>
             <w:vAlign w:val="center"/>
           </w:tcPr>
           <w:p>
@@ -5035,7 +5921,7 @@
               <w:right w:w="150" w:type="dxa"/>
               <w:bottom w:w="100" w:type="dxa"/>
             </w:tcMar>
-            <w:tcW w:w="5981" w:type="dxa"/>
+            <w:tcW w:w="3200" w:type="dxa"/>
             <w:vAlign w:val="center"/>
           </w:tcPr>
           <w:p>
@@ -5069,6 +5955,49 @@
                 <w:sz w:val="24"/>
                 <w:szCs w:val="24"/>
               </w:rPr>
+            </w:r>
+          </w:p>
+        </w:tc>
+        <w:tc>
+          <w:tcPr>
+            <w:tcBorders>
+              <w:top w:val="single" w:color="000000" w:sz="4" w:space="0"/>
+              <w:left w:val="single" w:color="000000" w:sz="4" w:space="0"/>
+              <w:bottom w:val="single" w:color="000000" w:sz="4" w:space="0"/>
+              <w:right w:val="single" w:color="000000" w:sz="4" w:space="0"/>
+            </w:tcBorders>
+            <w:tcMar>
+              <w:left w:w="150" w:type="dxa"/>
+              <w:top w:w="100" w:type="dxa"/>
+              <w:right w:w="150" w:type="dxa"/>
+              <w:bottom w:w="100" w:type="dxa"/>
+            </w:tcMar>
+            <w:tcW w:w="2900" w:type="dxa"/>
+            <w:vAlign w:val="center"/>
+          </w:tcPr>
+          <w:p>
+            <w:pPr>
+              <w:pBdr/>
+              <w:spacing w:line="240" w:lineRule="auto"/>
+              <w:ind/>
+              <w:jc w:val="left"/>
+              <w:rPr>
+                <w:rFonts w:ascii="Times New Roman" w:hAnsi="Times New Roman" w:cs="Times New Roman"/>
+                <w:color w:val="auto"/>
+                <w:sz w:val="24"/>
+                <w:szCs w:val="24"/>
+              </w:rPr>
+            </w:pPr>
+            <w:r>
+              <w:rPr>
+                <w:rFonts w:ascii="Times New Roman" w:hAnsi="Times New Roman" w:eastAsia="Times New Roman" w:cs="Times New Roman"/>
+                <w:b w:val="0"/>
+                <w:bCs w:val="0"/>
+                <w:color w:val="auto"/>
+                <w:sz w:val="24"/>
+                <w:szCs w:val="24"/>
+              </w:rPr>
+              <w:t xml:space="preserve">PRIMARY KEY, NOT NULL</w:t>
             </w:r>
           </w:p>
         </w:tc>
@@ -5089,7 +6018,7 @@
               <w:right w:w="150" w:type="dxa"/>
               <w:bottom w:w="100" w:type="dxa"/>
             </w:tcMar>
-            <w:tcW w:w="1395" w:type="dxa"/>
+            <w:tcW w:w="1700" w:type="dxa"/>
             <w:vAlign w:val="center"/>
           </w:tcPr>
           <w:p>
@@ -5140,7 +6069,7 @@
               <w:right w:w="150" w:type="dxa"/>
               <w:bottom w:w="100" w:type="dxa"/>
             </w:tcMar>
-            <w:tcW w:w="1984" w:type="dxa"/>
+            <w:tcW w:w="1560" w:type="dxa"/>
             <w:vAlign w:val="center"/>
           </w:tcPr>
           <w:p>
@@ -5191,7 +6120,7 @@
               <w:right w:w="150" w:type="dxa"/>
               <w:bottom w:w="100" w:type="dxa"/>
             </w:tcMar>
-            <w:tcW w:w="5981" w:type="dxa"/>
+            <w:tcW w:w="3200" w:type="dxa"/>
             <w:vAlign w:val="center"/>
           </w:tcPr>
           <w:p>
@@ -5225,6 +6154,49 @@
                 <w:sz w:val="24"/>
                 <w:szCs w:val="24"/>
               </w:rPr>
+            </w:r>
+          </w:p>
+        </w:tc>
+        <w:tc>
+          <w:tcPr>
+            <w:tcBorders>
+              <w:top w:val="single" w:color="000000" w:sz="4" w:space="0"/>
+              <w:left w:val="single" w:color="000000" w:sz="4" w:space="0"/>
+              <w:bottom w:val="single" w:color="000000" w:sz="4" w:space="0"/>
+              <w:right w:val="single" w:color="000000" w:sz="4" w:space="0"/>
+            </w:tcBorders>
+            <w:tcMar>
+              <w:left w:w="150" w:type="dxa"/>
+              <w:top w:w="100" w:type="dxa"/>
+              <w:right w:w="150" w:type="dxa"/>
+              <w:bottom w:w="100" w:type="dxa"/>
+            </w:tcMar>
+            <w:tcW w:w="2900" w:type="dxa"/>
+            <w:vAlign w:val="center"/>
+          </w:tcPr>
+          <w:p>
+            <w:pPr>
+              <w:pBdr/>
+              <w:spacing w:line="240" w:lineRule="auto"/>
+              <w:ind/>
+              <w:jc w:val="left"/>
+              <w:rPr>
+                <w:rFonts w:ascii="Times New Roman" w:hAnsi="Times New Roman" w:cs="Times New Roman"/>
+                <w:color w:val="auto"/>
+                <w:sz w:val="24"/>
+                <w:szCs w:val="24"/>
+              </w:rPr>
+            </w:pPr>
+            <w:r>
+              <w:rPr>
+                <w:rFonts w:ascii="Times New Roman" w:hAnsi="Times New Roman" w:eastAsia="Times New Roman" w:cs="Times New Roman"/>
+                <w:b w:val="0"/>
+                <w:bCs w:val="0"/>
+                <w:color w:val="auto"/>
+                <w:sz w:val="24"/>
+                <w:szCs w:val="24"/>
+              </w:rPr>
+              <w:t xml:space="preserve">NOT NULL, CHECK (IN: 'Sencilla', 'Doble', 'Suite')</w:t>
             </w:r>
           </w:p>
         </w:tc>
@@ -5245,7 +6217,7 @@
               <w:right w:w="150" w:type="dxa"/>
               <w:bottom w:w="100" w:type="dxa"/>
             </w:tcMar>
-            <w:tcW w:w="1395" w:type="dxa"/>
+            <w:tcW w:w="1700" w:type="dxa"/>
             <w:vAlign w:val="center"/>
           </w:tcPr>
           <w:p>
@@ -5296,7 +6268,7 @@
               <w:right w:w="150" w:type="dxa"/>
               <w:bottom w:w="100" w:type="dxa"/>
             </w:tcMar>
-            <w:tcW w:w="1984" w:type="dxa"/>
+            <w:tcW w:w="1560" w:type="dxa"/>
             <w:vAlign w:val="center"/>
           </w:tcPr>
           <w:p>
@@ -5347,7 +6319,7 @@
               <w:right w:w="150" w:type="dxa"/>
               <w:bottom w:w="100" w:type="dxa"/>
             </w:tcMar>
-            <w:tcW w:w="5981" w:type="dxa"/>
+            <w:tcW w:w="3200" w:type="dxa"/>
             <w:vAlign w:val="center"/>
           </w:tcPr>
           <w:p>
@@ -5381,6 +6353,49 @@
                 <w:sz w:val="24"/>
                 <w:szCs w:val="24"/>
               </w:rPr>
+            </w:r>
+          </w:p>
+        </w:tc>
+        <w:tc>
+          <w:tcPr>
+            <w:tcBorders>
+              <w:top w:val="single" w:color="000000" w:sz="4" w:space="0"/>
+              <w:left w:val="single" w:color="000000" w:sz="4" w:space="0"/>
+              <w:bottom w:val="single" w:color="000000" w:sz="4" w:space="0"/>
+              <w:right w:val="single" w:color="000000" w:sz="4" w:space="0"/>
+            </w:tcBorders>
+            <w:tcMar>
+              <w:left w:w="150" w:type="dxa"/>
+              <w:top w:w="100" w:type="dxa"/>
+              <w:right w:w="150" w:type="dxa"/>
+              <w:bottom w:w="100" w:type="dxa"/>
+            </w:tcMar>
+            <w:tcW w:w="2900" w:type="dxa"/>
+            <w:vAlign w:val="center"/>
+          </w:tcPr>
+          <w:p>
+            <w:pPr>
+              <w:pBdr/>
+              <w:spacing w:line="240" w:lineRule="auto"/>
+              <w:ind/>
+              <w:jc w:val="left"/>
+              <w:rPr>
+                <w:rFonts w:ascii="Times New Roman" w:hAnsi="Times New Roman" w:cs="Times New Roman"/>
+                <w:color w:val="auto"/>
+                <w:sz w:val="24"/>
+                <w:szCs w:val="24"/>
+              </w:rPr>
+            </w:pPr>
+            <w:r>
+              <w:rPr>
+                <w:rFonts w:ascii="Times New Roman" w:hAnsi="Times New Roman" w:eastAsia="Times New Roman" w:cs="Times New Roman"/>
+                <w:b w:val="0"/>
+                <w:bCs w:val="0"/>
+                <w:color w:val="auto"/>
+                <w:sz w:val="24"/>
+                <w:szCs w:val="24"/>
+              </w:rPr>
+              <w:t xml:space="preserve">NOT NULL, DEFAULT 'Disponible', CHECK (IN: 'Disponible', 'Ocupada', 'Mantenimiento')</w:t>
             </w:r>
           </w:p>
         </w:tc>
@@ -5401,7 +6416,7 @@
               <w:right w:w="150" w:type="dxa"/>
               <w:bottom w:w="100" w:type="dxa"/>
             </w:tcMar>
-            <w:tcW w:w="1395" w:type="dxa"/>
+            <w:tcW w:w="1700" w:type="dxa"/>
             <w:vAlign w:val="center"/>
           </w:tcPr>
           <w:p>
@@ -5452,7 +6467,7 @@
               <w:right w:w="150" w:type="dxa"/>
               <w:bottom w:w="100" w:type="dxa"/>
             </w:tcMar>
-            <w:tcW w:w="1984" w:type="dxa"/>
+            <w:tcW w:w="1560" w:type="dxa"/>
             <w:vAlign w:val="center"/>
           </w:tcPr>
           <w:p>
@@ -5503,7 +6518,7 @@
               <w:right w:w="150" w:type="dxa"/>
               <w:bottom w:w="100" w:type="dxa"/>
             </w:tcMar>
-            <w:tcW w:w="5981" w:type="dxa"/>
+            <w:tcW w:w="3200" w:type="dxa"/>
             <w:vAlign w:val="center"/>
           </w:tcPr>
           <w:p>
@@ -5540,6 +6555,49 @@
             </w:r>
           </w:p>
         </w:tc>
+        <w:tc>
+          <w:tcPr>
+            <w:tcBorders>
+              <w:top w:val="single" w:color="000000" w:sz="4" w:space="0"/>
+              <w:left w:val="single" w:color="000000" w:sz="4" w:space="0"/>
+              <w:bottom w:val="single" w:color="000000" w:sz="4" w:space="0"/>
+              <w:right w:val="single" w:color="000000" w:sz="4" w:space="0"/>
+            </w:tcBorders>
+            <w:tcMar>
+              <w:left w:w="150" w:type="dxa"/>
+              <w:top w:w="100" w:type="dxa"/>
+              <w:right w:w="150" w:type="dxa"/>
+              <w:bottom w:w="100" w:type="dxa"/>
+            </w:tcMar>
+            <w:tcW w:w="2900" w:type="dxa"/>
+            <w:vAlign w:val="center"/>
+          </w:tcPr>
+          <w:p>
+            <w:pPr>
+              <w:pBdr/>
+              <w:spacing w:line="240" w:lineRule="auto"/>
+              <w:ind/>
+              <w:jc w:val="left"/>
+              <w:rPr>
+                <w:rFonts w:ascii="Times New Roman" w:hAnsi="Times New Roman" w:cs="Times New Roman"/>
+                <w:color w:val="auto"/>
+                <w:sz w:val="24"/>
+                <w:szCs w:val="24"/>
+              </w:rPr>
+            </w:pPr>
+            <w:r>
+              <w:rPr>
+                <w:rFonts w:ascii="Times New Roman" w:hAnsi="Times New Roman" w:eastAsia="Times New Roman" w:cs="Times New Roman"/>
+                <w:b w:val="0"/>
+                <w:bCs w:val="0"/>
+                <w:color w:val="auto"/>
+                <w:sz w:val="24"/>
+                <w:szCs w:val="24"/>
+              </w:rPr>
+              <w:t xml:space="preserve">NOT NULL, CHECK (precio_noche &gt;= 0)</w:t>
+            </w:r>
+          </w:p>
+        </w:tc>
       </w:tr>
     </w:tbl>
     <w:p>
@@ -5554,28 +6612,6 @@
           <w:szCs w:val="24"/>
         </w:rPr>
       </w:pPr>
-      <w:r>
-        <w:rPr>
-          <w:rFonts w:ascii="Times New Roman" w:hAnsi="Times New Roman" w:eastAsia="Times New Roman" w:cs="Times New Roman"/>
-          <w:b/>
-          <w:bCs/>
-          <w:color w:val="auto"/>
-          <w:sz w:val="24"/>
-          <w:szCs w:val="24"/>
-          <w:highlight w:val="none"/>
-        </w:rPr>
-      </w:r>
-      <w:r>
-        <w:rPr>
-          <w:rFonts w:ascii="Times New Roman" w:hAnsi="Times New Roman" w:eastAsia="Times New Roman" w:cs="Times New Roman"/>
-          <w:b/>
-          <w:bCs/>
-          <w:color w:val="auto"/>
-          <w:sz w:val="24"/>
-          <w:szCs w:val="24"/>
-          <w:highlight w:val="none"/>
-        </w:rPr>
-      </w:r>
       <w:r>
         <w:rPr>
           <w:rFonts w:ascii="Times New Roman" w:hAnsi="Times New Roman" w:eastAsia="Times New Roman" w:cs="Times New Roman"/>
@@ -5683,9 +6719,10 @@
         <w:tblLook w:val="04A0" w:firstRow="1" w:lastRow="0" w:firstColumn="1" w:lastColumn="0" w:noHBand="0" w:noVBand="1"/>
       </w:tblPr>
       <w:tblGrid>
-        <w:gridCol w:w="1820"/>
-        <w:gridCol w:w="1984"/>
-        <w:gridCol w:w="5556"/>
+        <w:gridCol w:w="1700"/>
+        <w:gridCol w:w="1560"/>
+        <w:gridCol w:w="3200"/>
+        <w:gridCol w:w="2900"/>
       </w:tblGrid>
       <w:tr>
         <w:trPr>
@@ -5705,7 +6742,7 @@
               <w:right w:w="150" w:type="dxa"/>
               <w:bottom w:w="100" w:type="dxa"/>
             </w:tcMar>
-            <w:tcW w:w="1820" w:type="dxa"/>
+            <w:tcW w:w="1700" w:type="dxa"/>
             <w:vAlign w:val="center"/>
           </w:tcPr>
           <w:p>
@@ -5756,7 +6793,7 @@
               <w:right w:w="150" w:type="dxa"/>
               <w:bottom w:w="100" w:type="dxa"/>
             </w:tcMar>
-            <w:tcW w:w="1984" w:type="dxa"/>
+            <w:tcW w:w="1560" w:type="dxa"/>
             <w:vAlign w:val="center"/>
           </w:tcPr>
           <w:p>
@@ -5807,7 +6844,7 @@
               <w:right w:w="150" w:type="dxa"/>
               <w:bottom w:w="100" w:type="dxa"/>
             </w:tcMar>
-            <w:tcW w:w="5556" w:type="dxa"/>
+            <w:tcW w:w="3200" w:type="dxa"/>
             <w:vAlign w:val="center"/>
           </w:tcPr>
           <w:p>
@@ -5841,6 +6878,49 @@
                 <w:sz w:val="24"/>
                 <w:szCs w:val="24"/>
               </w:rPr>
+            </w:r>
+          </w:p>
+        </w:tc>
+        <w:tc>
+          <w:tcPr>
+            <w:tcBorders>
+              <w:top w:val="single" w:color="000000" w:sz="4" w:space="0"/>
+              <w:left w:val="single" w:color="000000" w:sz="4" w:space="0"/>
+              <w:bottom w:val="single" w:color="000000" w:sz="4" w:space="0"/>
+              <w:right w:val="single" w:color="000000" w:sz="4" w:space="0"/>
+            </w:tcBorders>
+            <w:tcMar>
+              <w:left w:w="150" w:type="dxa"/>
+              <w:top w:w="100" w:type="dxa"/>
+              <w:right w:w="150" w:type="dxa"/>
+              <w:bottom w:w="100" w:type="dxa"/>
+            </w:tcMar>
+            <w:tcW w:w="2900" w:type="dxa"/>
+            <w:vAlign w:val="center"/>
+          </w:tcPr>
+          <w:p>
+            <w:pPr>
+              <w:pBdr/>
+              <w:spacing w:line="240" w:lineRule="auto"/>
+              <w:ind/>
+              <w:jc w:val="center"/>
+              <w:rPr>
+                <w:rFonts w:ascii="Times New Roman" w:hAnsi="Times New Roman" w:cs="Times New Roman"/>
+                <w:color w:val="auto"/>
+                <w:sz w:val="24"/>
+                <w:szCs w:val="24"/>
+              </w:rPr>
+            </w:pPr>
+            <w:r>
+              <w:rPr>
+                <w:rFonts w:ascii="Times New Roman" w:hAnsi="Times New Roman" w:eastAsia="Times New Roman" w:cs="Times New Roman"/>
+                <w:b/>
+                <w:bCs/>
+                <w:color w:val="auto"/>
+                <w:sz w:val="24"/>
+                <w:szCs w:val="24"/>
+              </w:rPr>
+              <w:t xml:space="preserve">Restricciones</w:t>
             </w:r>
           </w:p>
         </w:tc>
@@ -5861,7 +6941,7 @@
               <w:right w:w="150" w:type="dxa"/>
               <w:bottom w:w="100" w:type="dxa"/>
             </w:tcMar>
-            <w:tcW w:w="1820" w:type="dxa"/>
+            <w:tcW w:w="1700" w:type="dxa"/>
             <w:vAlign w:val="center"/>
           </w:tcPr>
           <w:p>
@@ -5912,7 +6992,7 @@
               <w:right w:w="150" w:type="dxa"/>
               <w:bottom w:w="100" w:type="dxa"/>
             </w:tcMar>
-            <w:tcW w:w="1984" w:type="dxa"/>
+            <w:tcW w:w="1560" w:type="dxa"/>
             <w:vAlign w:val="center"/>
           </w:tcPr>
           <w:p>
@@ -5963,7 +7043,7 @@
               <w:right w:w="150" w:type="dxa"/>
               <w:bottom w:w="100" w:type="dxa"/>
             </w:tcMar>
-            <w:tcW w:w="5556" w:type="dxa"/>
+            <w:tcW w:w="3200" w:type="dxa"/>
             <w:vAlign w:val="center"/>
           </w:tcPr>
           <w:p>
@@ -5997,6 +7077,49 @@
                 <w:sz w:val="24"/>
                 <w:szCs w:val="24"/>
               </w:rPr>
+            </w:r>
+          </w:p>
+        </w:tc>
+        <w:tc>
+          <w:tcPr>
+            <w:tcBorders>
+              <w:top w:val="single" w:color="000000" w:sz="4" w:space="0"/>
+              <w:left w:val="single" w:color="000000" w:sz="4" w:space="0"/>
+              <w:bottom w:val="single" w:color="000000" w:sz="4" w:space="0"/>
+              <w:right w:val="single" w:color="000000" w:sz="4" w:space="0"/>
+            </w:tcBorders>
+            <w:tcMar>
+              <w:left w:w="150" w:type="dxa"/>
+              <w:top w:w="100" w:type="dxa"/>
+              <w:right w:w="150" w:type="dxa"/>
+              <w:bottom w:w="100" w:type="dxa"/>
+            </w:tcMar>
+            <w:tcW w:w="2900" w:type="dxa"/>
+            <w:vAlign w:val="center"/>
+          </w:tcPr>
+          <w:p>
+            <w:pPr>
+              <w:pBdr/>
+              <w:spacing w:line="240" w:lineRule="auto"/>
+              <w:ind/>
+              <w:jc w:val="left"/>
+              <w:rPr>
+                <w:rFonts w:ascii="Times New Roman" w:hAnsi="Times New Roman" w:cs="Times New Roman"/>
+                <w:color w:val="auto"/>
+                <w:sz w:val="24"/>
+                <w:szCs w:val="24"/>
+              </w:rPr>
+            </w:pPr>
+            <w:r>
+              <w:rPr>
+                <w:rFonts w:ascii="Times New Roman" w:hAnsi="Times New Roman" w:eastAsia="Times New Roman" w:cs="Times New Roman"/>
+                <w:b w:val="0"/>
+                <w:bCs w:val="0"/>
+                <w:color w:val="auto"/>
+                <w:sz w:val="24"/>
+                <w:szCs w:val="24"/>
+              </w:rPr>
+              <w:t xml:space="preserve">PRIMARY KEY, NOT NULL, AUTO_INCREMENT</w:t>
             </w:r>
           </w:p>
         </w:tc>
@@ -6017,7 +7140,7 @@
               <w:right w:w="150" w:type="dxa"/>
               <w:bottom w:w="100" w:type="dxa"/>
             </w:tcMar>
-            <w:tcW w:w="1820" w:type="dxa"/>
+            <w:tcW w:w="1700" w:type="dxa"/>
             <w:vAlign w:val="center"/>
           </w:tcPr>
           <w:p>
@@ -6068,7 +7191,7 @@
               <w:right w:w="150" w:type="dxa"/>
               <w:bottom w:w="100" w:type="dxa"/>
             </w:tcMar>
-            <w:tcW w:w="1984" w:type="dxa"/>
+            <w:tcW w:w="1560" w:type="dxa"/>
             <w:vAlign w:val="center"/>
           </w:tcPr>
           <w:p>
@@ -6119,7 +7242,7 @@
               <w:right w:w="150" w:type="dxa"/>
               <w:bottom w:w="100" w:type="dxa"/>
             </w:tcMar>
-            <w:tcW w:w="5556" w:type="dxa"/>
+            <w:tcW w:w="3200" w:type="dxa"/>
             <w:vAlign w:val="center"/>
           </w:tcPr>
           <w:p>
@@ -6153,6 +7276,49 @@
                 <w:sz w:val="24"/>
                 <w:szCs w:val="24"/>
               </w:rPr>
+            </w:r>
+          </w:p>
+        </w:tc>
+        <w:tc>
+          <w:tcPr>
+            <w:tcBorders>
+              <w:top w:val="single" w:color="000000" w:sz="4" w:space="0"/>
+              <w:left w:val="single" w:color="000000" w:sz="4" w:space="0"/>
+              <w:bottom w:val="single" w:color="000000" w:sz="4" w:space="0"/>
+              <w:right w:val="single" w:color="000000" w:sz="4" w:space="0"/>
+            </w:tcBorders>
+            <w:tcMar>
+              <w:left w:w="150" w:type="dxa"/>
+              <w:top w:w="100" w:type="dxa"/>
+              <w:right w:w="150" w:type="dxa"/>
+              <w:bottom w:w="100" w:type="dxa"/>
+            </w:tcMar>
+            <w:tcW w:w="2900" w:type="dxa"/>
+            <w:vAlign w:val="center"/>
+          </w:tcPr>
+          <w:p>
+            <w:pPr>
+              <w:pBdr/>
+              <w:spacing w:line="240" w:lineRule="auto"/>
+              <w:ind/>
+              <w:jc w:val="left"/>
+              <w:rPr>
+                <w:rFonts w:ascii="Times New Roman" w:hAnsi="Times New Roman" w:cs="Times New Roman"/>
+                <w:color w:val="auto"/>
+                <w:sz w:val="24"/>
+                <w:szCs w:val="24"/>
+              </w:rPr>
+            </w:pPr>
+            <w:r>
+              <w:rPr>
+                <w:rFonts w:ascii="Times New Roman" w:hAnsi="Times New Roman" w:eastAsia="Times New Roman" w:cs="Times New Roman"/>
+                <w:b w:val="0"/>
+                <w:bCs w:val="0"/>
+                <w:color w:val="auto"/>
+                <w:sz w:val="24"/>
+                <w:szCs w:val="24"/>
+              </w:rPr>
+              <w:t xml:space="preserve">NOT NULL, FK → cliente(id_cliente), ON DELETE RESTRICT, ON UPDATE CASCADE</w:t>
             </w:r>
           </w:p>
         </w:tc>
@@ -6173,7 +7339,7 @@
               <w:right w:w="150" w:type="dxa"/>
               <w:bottom w:w="100" w:type="dxa"/>
             </w:tcMar>
-            <w:tcW w:w="1820" w:type="dxa"/>
+            <w:tcW w:w="1700" w:type="dxa"/>
             <w:vAlign w:val="center"/>
           </w:tcPr>
           <w:p>
@@ -6224,7 +7390,7 @@
               <w:right w:w="150" w:type="dxa"/>
               <w:bottom w:w="100" w:type="dxa"/>
             </w:tcMar>
-            <w:tcW w:w="1984" w:type="dxa"/>
+            <w:tcW w:w="1560" w:type="dxa"/>
             <w:vAlign w:val="center"/>
           </w:tcPr>
           <w:p>
@@ -6275,7 +7441,7 @@
               <w:right w:w="150" w:type="dxa"/>
               <w:bottom w:w="100" w:type="dxa"/>
             </w:tcMar>
-            <w:tcW w:w="5556" w:type="dxa"/>
+            <w:tcW w:w="3200" w:type="dxa"/>
             <w:vAlign w:val="center"/>
           </w:tcPr>
           <w:p>
@@ -6309,6 +7475,49 @@
                 <w:sz w:val="24"/>
                 <w:szCs w:val="24"/>
               </w:rPr>
+            </w:r>
+          </w:p>
+        </w:tc>
+        <w:tc>
+          <w:tcPr>
+            <w:tcBorders>
+              <w:top w:val="single" w:color="000000" w:sz="4" w:space="0"/>
+              <w:left w:val="single" w:color="000000" w:sz="4" w:space="0"/>
+              <w:bottom w:val="single" w:color="000000" w:sz="4" w:space="0"/>
+              <w:right w:val="single" w:color="000000" w:sz="4" w:space="0"/>
+            </w:tcBorders>
+            <w:tcMar>
+              <w:left w:w="150" w:type="dxa"/>
+              <w:top w:w="100" w:type="dxa"/>
+              <w:right w:w="150" w:type="dxa"/>
+              <w:bottom w:w="100" w:type="dxa"/>
+            </w:tcMar>
+            <w:tcW w:w="2900" w:type="dxa"/>
+            <w:vAlign w:val="center"/>
+          </w:tcPr>
+          <w:p>
+            <w:pPr>
+              <w:pBdr/>
+              <w:spacing w:line="240" w:lineRule="auto"/>
+              <w:ind/>
+              <w:jc w:val="left"/>
+              <w:rPr>
+                <w:rFonts w:ascii="Times New Roman" w:hAnsi="Times New Roman" w:cs="Times New Roman"/>
+                <w:color w:val="auto"/>
+                <w:sz w:val="24"/>
+                <w:szCs w:val="24"/>
+              </w:rPr>
+            </w:pPr>
+            <w:r>
+              <w:rPr>
+                <w:rFonts w:ascii="Times New Roman" w:hAnsi="Times New Roman" w:eastAsia="Times New Roman" w:cs="Times New Roman"/>
+                <w:b w:val="0"/>
+                <w:bCs w:val="0"/>
+                <w:color w:val="auto"/>
+                <w:sz w:val="24"/>
+                <w:szCs w:val="24"/>
+              </w:rPr>
+              <w:t xml:space="preserve">NOT NULL, FK → habitacion(numero_h), ON DELETE RESTRICT, ON UPDATE CASCADE</w:t>
             </w:r>
           </w:p>
         </w:tc>
@@ -6329,7 +7538,7 @@
               <w:right w:w="150" w:type="dxa"/>
               <w:bottom w:w="100" w:type="dxa"/>
             </w:tcMar>
-            <w:tcW w:w="1820" w:type="dxa"/>
+            <w:tcW w:w="1700" w:type="dxa"/>
             <w:vAlign w:val="center"/>
           </w:tcPr>
           <w:p>
@@ -6380,7 +7589,7 @@
               <w:right w:w="150" w:type="dxa"/>
               <w:bottom w:w="100" w:type="dxa"/>
             </w:tcMar>
-            <w:tcW w:w="1984" w:type="dxa"/>
+            <w:tcW w:w="1560" w:type="dxa"/>
             <w:vAlign w:val="center"/>
           </w:tcPr>
           <w:p>
@@ -6431,7 +7640,7 @@
               <w:right w:w="150" w:type="dxa"/>
               <w:bottom w:w="100" w:type="dxa"/>
             </w:tcMar>
-            <w:tcW w:w="5556" w:type="dxa"/>
+            <w:tcW w:w="3200" w:type="dxa"/>
             <w:vAlign w:val="center"/>
           </w:tcPr>
           <w:p>
@@ -6465,6 +7674,49 @@
                 <w:sz w:val="24"/>
                 <w:szCs w:val="24"/>
               </w:rPr>
+            </w:r>
+          </w:p>
+        </w:tc>
+        <w:tc>
+          <w:tcPr>
+            <w:tcBorders>
+              <w:top w:val="single" w:color="000000" w:sz="4" w:space="0"/>
+              <w:left w:val="single" w:color="000000" w:sz="4" w:space="0"/>
+              <w:bottom w:val="single" w:color="000000" w:sz="4" w:space="0"/>
+              <w:right w:val="single" w:color="000000" w:sz="4" w:space="0"/>
+            </w:tcBorders>
+            <w:tcMar>
+              <w:left w:w="150" w:type="dxa"/>
+              <w:top w:w="100" w:type="dxa"/>
+              <w:right w:w="150" w:type="dxa"/>
+              <w:bottom w:w="100" w:type="dxa"/>
+            </w:tcMar>
+            <w:tcW w:w="2900" w:type="dxa"/>
+            <w:vAlign w:val="center"/>
+          </w:tcPr>
+          <w:p>
+            <w:pPr>
+              <w:pBdr/>
+              <w:spacing w:line="240" w:lineRule="auto"/>
+              <w:ind/>
+              <w:jc w:val="left"/>
+              <w:rPr>
+                <w:rFonts w:ascii="Times New Roman" w:hAnsi="Times New Roman" w:cs="Times New Roman"/>
+                <w:color w:val="auto"/>
+                <w:sz w:val="24"/>
+                <w:szCs w:val="24"/>
+              </w:rPr>
+            </w:pPr>
+            <w:r>
+              <w:rPr>
+                <w:rFonts w:ascii="Times New Roman" w:hAnsi="Times New Roman" w:eastAsia="Times New Roman" w:cs="Times New Roman"/>
+                <w:b w:val="0"/>
+                <w:bCs w:val="0"/>
+                <w:color w:val="auto"/>
+                <w:sz w:val="24"/>
+                <w:szCs w:val="24"/>
+              </w:rPr>
+              <w:t xml:space="preserve">NOT NULL, CHECK (fecha_salida &gt;= fecha_llegada)</w:t>
             </w:r>
           </w:p>
         </w:tc>
@@ -6485,7 +7737,7 @@
               <w:right w:w="150" w:type="dxa"/>
               <w:bottom w:w="100" w:type="dxa"/>
             </w:tcMar>
-            <w:tcW w:w="1820" w:type="dxa"/>
+            <w:tcW w:w="1700" w:type="dxa"/>
             <w:vAlign w:val="center"/>
           </w:tcPr>
           <w:p>
@@ -6536,7 +7788,7 @@
               <w:right w:w="150" w:type="dxa"/>
               <w:bottom w:w="100" w:type="dxa"/>
             </w:tcMar>
-            <w:tcW w:w="1984" w:type="dxa"/>
+            <w:tcW w:w="1560" w:type="dxa"/>
             <w:vAlign w:val="center"/>
           </w:tcPr>
           <w:p>
@@ -6587,7 +7839,7 @@
               <w:right w:w="150" w:type="dxa"/>
               <w:bottom w:w="100" w:type="dxa"/>
             </w:tcMar>
-            <w:tcW w:w="5556" w:type="dxa"/>
+            <w:tcW w:w="3200" w:type="dxa"/>
             <w:vAlign w:val="center"/>
           </w:tcPr>
           <w:p>
@@ -6621,6 +7873,49 @@
                 <w:sz w:val="24"/>
                 <w:szCs w:val="24"/>
               </w:rPr>
+            </w:r>
+          </w:p>
+        </w:tc>
+        <w:tc>
+          <w:tcPr>
+            <w:tcBorders>
+              <w:top w:val="single" w:color="000000" w:sz="4" w:space="0"/>
+              <w:left w:val="single" w:color="000000" w:sz="4" w:space="0"/>
+              <w:bottom w:val="single" w:color="000000" w:sz="4" w:space="0"/>
+              <w:right w:val="single" w:color="000000" w:sz="4" w:space="0"/>
+            </w:tcBorders>
+            <w:tcMar>
+              <w:left w:w="150" w:type="dxa"/>
+              <w:top w:w="100" w:type="dxa"/>
+              <w:right w:w="150" w:type="dxa"/>
+              <w:bottom w:w="100" w:type="dxa"/>
+            </w:tcMar>
+            <w:tcW w:w="2900" w:type="dxa"/>
+            <w:vAlign w:val="center"/>
+          </w:tcPr>
+          <w:p>
+            <w:pPr>
+              <w:pBdr/>
+              <w:spacing w:line="240" w:lineRule="auto"/>
+              <w:ind/>
+              <w:jc w:val="left"/>
+              <w:rPr>
+                <w:rFonts w:ascii="Times New Roman" w:hAnsi="Times New Roman" w:cs="Times New Roman"/>
+                <w:color w:val="auto"/>
+                <w:sz w:val="24"/>
+                <w:szCs w:val="24"/>
+              </w:rPr>
+            </w:pPr>
+            <w:r>
+              <w:rPr>
+                <w:rFonts w:ascii="Times New Roman" w:hAnsi="Times New Roman" w:eastAsia="Times New Roman" w:cs="Times New Roman"/>
+                <w:b w:val="0"/>
+                <w:bCs w:val="0"/>
+                <w:color w:val="auto"/>
+                <w:sz w:val="24"/>
+                <w:szCs w:val="24"/>
+              </w:rPr>
+              <w:t xml:space="preserve">NOT NULL, CHECK (fecha_salida &gt;= fecha_llegada)</w:t>
             </w:r>
           </w:p>
         </w:tc>
@@ -6641,7 +7936,7 @@
               <w:right w:w="150" w:type="dxa"/>
               <w:bottom w:w="100" w:type="dxa"/>
             </w:tcMar>
-            <w:tcW w:w="1820" w:type="dxa"/>
+            <w:tcW w:w="1700" w:type="dxa"/>
             <w:vAlign w:val="center"/>
           </w:tcPr>
           <w:p>
@@ -6692,7 +7987,7 @@
               <w:right w:w="150" w:type="dxa"/>
               <w:bottom w:w="100" w:type="dxa"/>
             </w:tcMar>
-            <w:tcW w:w="1984" w:type="dxa"/>
+            <w:tcW w:w="1560" w:type="dxa"/>
             <w:vAlign w:val="center"/>
           </w:tcPr>
           <w:p>
@@ -6743,7 +8038,7 @@
               <w:right w:w="150" w:type="dxa"/>
               <w:bottom w:w="100" w:type="dxa"/>
             </w:tcMar>
-            <w:tcW w:w="5556" w:type="dxa"/>
+            <w:tcW w:w="3200" w:type="dxa"/>
             <w:vAlign w:val="center"/>
           </w:tcPr>
           <w:p>
@@ -6777,6 +8072,49 @@
                 <w:sz w:val="24"/>
                 <w:szCs w:val="24"/>
               </w:rPr>
+            </w:r>
+          </w:p>
+        </w:tc>
+        <w:tc>
+          <w:tcPr>
+            <w:tcBorders>
+              <w:top w:val="single" w:color="000000" w:sz="4" w:space="0"/>
+              <w:left w:val="single" w:color="000000" w:sz="4" w:space="0"/>
+              <w:bottom w:val="single" w:color="000000" w:sz="4" w:space="0"/>
+              <w:right w:val="single" w:color="000000" w:sz="4" w:space="0"/>
+            </w:tcBorders>
+            <w:tcMar>
+              <w:left w:w="150" w:type="dxa"/>
+              <w:top w:w="100" w:type="dxa"/>
+              <w:right w:w="150" w:type="dxa"/>
+              <w:bottom w:w="100" w:type="dxa"/>
+            </w:tcMar>
+            <w:tcW w:w="2900" w:type="dxa"/>
+            <w:vAlign w:val="center"/>
+          </w:tcPr>
+          <w:p>
+            <w:pPr>
+              <w:pBdr/>
+              <w:spacing w:line="240" w:lineRule="auto"/>
+              <w:ind/>
+              <w:jc w:val="left"/>
+              <w:rPr>
+                <w:rFonts w:ascii="Times New Roman" w:hAnsi="Times New Roman" w:cs="Times New Roman"/>
+                <w:color w:val="auto"/>
+                <w:sz w:val="24"/>
+                <w:szCs w:val="24"/>
+              </w:rPr>
+            </w:pPr>
+            <w:r>
+              <w:rPr>
+                <w:rFonts w:ascii="Times New Roman" w:hAnsi="Times New Roman" w:eastAsia="Times New Roman" w:cs="Times New Roman"/>
+                <w:b w:val="0"/>
+                <w:bCs w:val="0"/>
+                <w:color w:val="auto"/>
+                <w:sz w:val="24"/>
+                <w:szCs w:val="24"/>
+              </w:rPr>
+              <w:t xml:space="preserve">NOT NULL, CHECK (valor_reserva &gt;= 0)</w:t>
             </w:r>
           </w:p>
         </w:tc>
@@ -6797,7 +8135,7 @@
               <w:right w:w="150" w:type="dxa"/>
               <w:bottom w:w="100" w:type="dxa"/>
             </w:tcMar>
-            <w:tcW w:w="1820" w:type="dxa"/>
+            <w:tcW w:w="1700" w:type="dxa"/>
             <w:vAlign w:val="center"/>
           </w:tcPr>
           <w:p>
@@ -6848,7 +8186,7 @@
               <w:right w:w="150" w:type="dxa"/>
               <w:bottom w:w="100" w:type="dxa"/>
             </w:tcMar>
-            <w:tcW w:w="1984" w:type="dxa"/>
+            <w:tcW w:w="1560" w:type="dxa"/>
             <w:vAlign w:val="center"/>
           </w:tcPr>
           <w:p>
@@ -6899,7 +8237,7 @@
               <w:right w:w="150" w:type="dxa"/>
               <w:bottom w:w="100" w:type="dxa"/>
             </w:tcMar>
-            <w:tcW w:w="5556" w:type="dxa"/>
+            <w:tcW w:w="3200" w:type="dxa"/>
             <w:vAlign w:val="center"/>
           </w:tcPr>
           <w:p>
@@ -6936,6 +8274,49 @@
             </w:r>
           </w:p>
         </w:tc>
+        <w:tc>
+          <w:tcPr>
+            <w:tcBorders>
+              <w:top w:val="single" w:color="000000" w:sz="4" w:space="0"/>
+              <w:left w:val="single" w:color="000000" w:sz="4" w:space="0"/>
+              <w:bottom w:val="single" w:color="000000" w:sz="4" w:space="0"/>
+              <w:right w:val="single" w:color="000000" w:sz="4" w:space="0"/>
+            </w:tcBorders>
+            <w:tcMar>
+              <w:left w:w="150" w:type="dxa"/>
+              <w:top w:w="100" w:type="dxa"/>
+              <w:right w:w="150" w:type="dxa"/>
+              <w:bottom w:w="100" w:type="dxa"/>
+            </w:tcMar>
+            <w:tcW w:w="2900" w:type="dxa"/>
+            <w:vAlign w:val="center"/>
+          </w:tcPr>
+          <w:p>
+            <w:pPr>
+              <w:pBdr/>
+              <w:spacing w:line="240" w:lineRule="auto"/>
+              <w:ind/>
+              <w:jc w:val="left"/>
+              <w:rPr>
+                <w:rFonts w:ascii="Times New Roman" w:hAnsi="Times New Roman" w:cs="Times New Roman"/>
+                <w:color w:val="auto"/>
+                <w:sz w:val="24"/>
+                <w:szCs w:val="24"/>
+              </w:rPr>
+            </w:pPr>
+            <w:r>
+              <w:rPr>
+                <w:rFonts w:ascii="Times New Roman" w:hAnsi="Times New Roman" w:eastAsia="Times New Roman" w:cs="Times New Roman"/>
+                <w:b w:val="0"/>
+                <w:bCs w:val="0"/>
+                <w:color w:val="auto"/>
+                <w:sz w:val="24"/>
+                <w:szCs w:val="24"/>
+              </w:rPr>
+              <w:t xml:space="preserve">NOT NULL, CHECK (tiempo_maxC &gt;= 0)</w:t>
+            </w:r>
+          </w:p>
+        </w:tc>
       </w:tr>
     </w:tbl>
     <w:p>
@@ -6950,28 +8331,6 @@
           <w:szCs w:val="24"/>
         </w:rPr>
       </w:pPr>
-      <w:r>
-        <w:rPr>
-          <w:rFonts w:ascii="Times New Roman" w:hAnsi="Times New Roman" w:eastAsia="Times New Roman" w:cs="Times New Roman"/>
-          <w:b/>
-          <w:bCs/>
-          <w:color w:val="auto"/>
-          <w:sz w:val="24"/>
-          <w:szCs w:val="24"/>
-          <w:highlight w:val="none"/>
-        </w:rPr>
-      </w:r>
-      <w:r>
-        <w:rPr>
-          <w:rFonts w:ascii="Times New Roman" w:hAnsi="Times New Roman" w:eastAsia="Times New Roman" w:cs="Times New Roman"/>
-          <w:b/>
-          <w:bCs/>
-          <w:color w:val="auto"/>
-          <w:sz w:val="24"/>
-          <w:szCs w:val="24"/>
-          <w:highlight w:val="none"/>
-        </w:rPr>
-      </w:r>
       <w:r>
         <w:rPr>
           <w:rFonts w:ascii="Times New Roman" w:hAnsi="Times New Roman" w:eastAsia="Times New Roman" w:cs="Times New Roman"/>
@@ -7079,9 +8438,10 @@
         <w:tblLook w:val="04A0" w:firstRow="1" w:lastRow="0" w:firstColumn="1" w:lastColumn="0" w:noHBand="0" w:noVBand="1"/>
       </w:tblPr>
       <w:tblGrid>
-        <w:gridCol w:w="1536"/>
-        <w:gridCol w:w="2126"/>
-        <w:gridCol w:w="5698"/>
+        <w:gridCol w:w="1700"/>
+        <w:gridCol w:w="1560"/>
+        <w:gridCol w:w="3200"/>
+        <w:gridCol w:w="2900"/>
       </w:tblGrid>
       <w:tr>
         <w:trPr>
@@ -7101,7 +8461,7 @@
               <w:right w:w="150" w:type="dxa"/>
               <w:bottom w:w="100" w:type="dxa"/>
             </w:tcMar>
-            <w:tcW w:w="1536" w:type="dxa"/>
+            <w:tcW w:w="1700" w:type="dxa"/>
             <w:vAlign w:val="center"/>
           </w:tcPr>
           <w:p>
@@ -7152,7 +8512,7 @@
               <w:right w:w="150" w:type="dxa"/>
               <w:bottom w:w="100" w:type="dxa"/>
             </w:tcMar>
-            <w:tcW w:w="2126" w:type="dxa"/>
+            <w:tcW w:w="1560" w:type="dxa"/>
             <w:vAlign w:val="center"/>
           </w:tcPr>
           <w:p>
@@ -7203,7 +8563,7 @@
               <w:right w:w="150" w:type="dxa"/>
               <w:bottom w:w="100" w:type="dxa"/>
             </w:tcMar>
-            <w:tcW w:w="5698" w:type="dxa"/>
+            <w:tcW w:w="3200" w:type="dxa"/>
             <w:vAlign w:val="center"/>
           </w:tcPr>
           <w:p>
@@ -7237,6 +8597,49 @@
                 <w:sz w:val="24"/>
                 <w:szCs w:val="24"/>
               </w:rPr>
+            </w:r>
+          </w:p>
+        </w:tc>
+        <w:tc>
+          <w:tcPr>
+            <w:tcBorders>
+              <w:top w:val="single" w:color="000000" w:sz="4" w:space="0"/>
+              <w:left w:val="single" w:color="000000" w:sz="4" w:space="0"/>
+              <w:bottom w:val="single" w:color="000000" w:sz="4" w:space="0"/>
+              <w:right w:val="single" w:color="000000" w:sz="4" w:space="0"/>
+            </w:tcBorders>
+            <w:tcMar>
+              <w:left w:w="150" w:type="dxa"/>
+              <w:top w:w="100" w:type="dxa"/>
+              <w:right w:w="150" w:type="dxa"/>
+              <w:bottom w:w="100" w:type="dxa"/>
+            </w:tcMar>
+            <w:tcW w:w="2900" w:type="dxa"/>
+            <w:vAlign w:val="center"/>
+          </w:tcPr>
+          <w:p>
+            <w:pPr>
+              <w:pBdr/>
+              <w:spacing w:line="240" w:lineRule="auto"/>
+              <w:ind/>
+              <w:jc w:val="center"/>
+              <w:rPr>
+                <w:rFonts w:ascii="Times New Roman" w:hAnsi="Times New Roman" w:cs="Times New Roman"/>
+                <w:color w:val="auto"/>
+                <w:sz w:val="24"/>
+                <w:szCs w:val="24"/>
+              </w:rPr>
+            </w:pPr>
+            <w:r>
+              <w:rPr>
+                <w:rFonts w:ascii="Times New Roman" w:hAnsi="Times New Roman" w:eastAsia="Times New Roman" w:cs="Times New Roman"/>
+                <w:b/>
+                <w:bCs/>
+                <w:color w:val="auto"/>
+                <w:sz w:val="24"/>
+                <w:szCs w:val="24"/>
+              </w:rPr>
+              <w:t xml:space="preserve">Restricciones</w:t>
             </w:r>
           </w:p>
         </w:tc>
@@ -7257,7 +8660,7 @@
               <w:right w:w="150" w:type="dxa"/>
               <w:bottom w:w="100" w:type="dxa"/>
             </w:tcMar>
-            <w:tcW w:w="1536" w:type="dxa"/>
+            <w:tcW w:w="1700" w:type="dxa"/>
             <w:vAlign w:val="center"/>
           </w:tcPr>
           <w:p>
@@ -7308,7 +8711,7 @@
               <w:right w:w="150" w:type="dxa"/>
               <w:bottom w:w="100" w:type="dxa"/>
             </w:tcMar>
-            <w:tcW w:w="2126" w:type="dxa"/>
+            <w:tcW w:w="1560" w:type="dxa"/>
             <w:vAlign w:val="center"/>
           </w:tcPr>
           <w:p>
@@ -7359,7 +8762,7 @@
               <w:right w:w="150" w:type="dxa"/>
               <w:bottom w:w="100" w:type="dxa"/>
             </w:tcMar>
-            <w:tcW w:w="5698" w:type="dxa"/>
+            <w:tcW w:w="3200" w:type="dxa"/>
             <w:vAlign w:val="center"/>
           </w:tcPr>
           <w:p>
@@ -7393,6 +8796,49 @@
                 <w:sz w:val="24"/>
                 <w:szCs w:val="24"/>
               </w:rPr>
+            </w:r>
+          </w:p>
+        </w:tc>
+        <w:tc>
+          <w:tcPr>
+            <w:tcBorders>
+              <w:top w:val="single" w:color="000000" w:sz="4" w:space="0"/>
+              <w:left w:val="single" w:color="000000" w:sz="4" w:space="0"/>
+              <w:bottom w:val="single" w:color="000000" w:sz="4" w:space="0"/>
+              <w:right w:val="single" w:color="000000" w:sz="4" w:space="0"/>
+            </w:tcBorders>
+            <w:tcMar>
+              <w:left w:w="150" w:type="dxa"/>
+              <w:top w:w="100" w:type="dxa"/>
+              <w:right w:w="150" w:type="dxa"/>
+              <w:bottom w:w="100" w:type="dxa"/>
+            </w:tcMar>
+            <w:tcW w:w="2900" w:type="dxa"/>
+            <w:vAlign w:val="center"/>
+          </w:tcPr>
+          <w:p>
+            <w:pPr>
+              <w:pBdr/>
+              <w:spacing w:line="240" w:lineRule="auto"/>
+              <w:ind/>
+              <w:jc w:val="left"/>
+              <w:rPr>
+                <w:rFonts w:ascii="Times New Roman" w:hAnsi="Times New Roman" w:cs="Times New Roman"/>
+                <w:color w:val="auto"/>
+                <w:sz w:val="24"/>
+                <w:szCs w:val="24"/>
+              </w:rPr>
+            </w:pPr>
+            <w:r>
+              <w:rPr>
+                <w:rFonts w:ascii="Times New Roman" w:hAnsi="Times New Roman" w:eastAsia="Times New Roman" w:cs="Times New Roman"/>
+                <w:b w:val="0"/>
+                <w:bCs w:val="0"/>
+                <w:color w:val="auto"/>
+                <w:sz w:val="24"/>
+                <w:szCs w:val="24"/>
+              </w:rPr>
+              <w:t xml:space="preserve">PRIMARY KEY, NOT NULL, AUTO_INCREMENT</w:t>
             </w:r>
           </w:p>
         </w:tc>
@@ -7413,7 +8859,7 @@
               <w:right w:w="150" w:type="dxa"/>
               <w:bottom w:w="100" w:type="dxa"/>
             </w:tcMar>
-            <w:tcW w:w="1536" w:type="dxa"/>
+            <w:tcW w:w="1700" w:type="dxa"/>
             <w:vAlign w:val="center"/>
           </w:tcPr>
           <w:p>
@@ -7464,7 +8910,7 @@
               <w:right w:w="150" w:type="dxa"/>
               <w:bottom w:w="100" w:type="dxa"/>
             </w:tcMar>
-            <w:tcW w:w="2126" w:type="dxa"/>
+            <w:tcW w:w="1560" w:type="dxa"/>
             <w:vAlign w:val="center"/>
           </w:tcPr>
           <w:p>
@@ -7515,7 +8961,7 @@
               <w:right w:w="150" w:type="dxa"/>
               <w:bottom w:w="100" w:type="dxa"/>
             </w:tcMar>
-            <w:tcW w:w="5698" w:type="dxa"/>
+            <w:tcW w:w="3200" w:type="dxa"/>
             <w:vAlign w:val="center"/>
           </w:tcPr>
           <w:p>
@@ -7549,6 +8995,49 @@
                 <w:sz w:val="24"/>
                 <w:szCs w:val="24"/>
               </w:rPr>
+            </w:r>
+          </w:p>
+        </w:tc>
+        <w:tc>
+          <w:tcPr>
+            <w:tcBorders>
+              <w:top w:val="single" w:color="000000" w:sz="4" w:space="0"/>
+              <w:left w:val="single" w:color="000000" w:sz="4" w:space="0"/>
+              <w:bottom w:val="single" w:color="000000" w:sz="4" w:space="0"/>
+              <w:right w:val="single" w:color="000000" w:sz="4" w:space="0"/>
+            </w:tcBorders>
+            <w:tcMar>
+              <w:left w:w="150" w:type="dxa"/>
+              <w:top w:w="100" w:type="dxa"/>
+              <w:right w:w="150" w:type="dxa"/>
+              <w:bottom w:w="100" w:type="dxa"/>
+            </w:tcMar>
+            <w:tcW w:w="2900" w:type="dxa"/>
+            <w:vAlign w:val="center"/>
+          </w:tcPr>
+          <w:p>
+            <w:pPr>
+              <w:pBdr/>
+              <w:spacing w:line="240" w:lineRule="auto"/>
+              <w:ind/>
+              <w:jc w:val="left"/>
+              <w:rPr>
+                <w:rFonts w:ascii="Times New Roman" w:hAnsi="Times New Roman" w:cs="Times New Roman"/>
+                <w:color w:val="auto"/>
+                <w:sz w:val="24"/>
+                <w:szCs w:val="24"/>
+              </w:rPr>
+            </w:pPr>
+            <w:r>
+              <w:rPr>
+                <w:rFonts w:ascii="Times New Roman" w:hAnsi="Times New Roman" w:eastAsia="Times New Roman" w:cs="Times New Roman"/>
+                <w:b w:val="0"/>
+                <w:bCs w:val="0"/>
+                <w:color w:val="auto"/>
+                <w:sz w:val="24"/>
+                <w:szCs w:val="24"/>
+              </w:rPr>
+              <w:t xml:space="preserve">NOT NULL</w:t>
             </w:r>
           </w:p>
         </w:tc>
@@ -7569,7 +9058,7 @@
               <w:right w:w="150" w:type="dxa"/>
               <w:bottom w:w="100" w:type="dxa"/>
             </w:tcMar>
-            <w:tcW w:w="1536" w:type="dxa"/>
+            <w:tcW w:w="1700" w:type="dxa"/>
             <w:vAlign w:val="center"/>
           </w:tcPr>
           <w:p>
@@ -7620,7 +9109,7 @@
               <w:right w:w="150" w:type="dxa"/>
               <w:bottom w:w="100" w:type="dxa"/>
             </w:tcMar>
-            <w:tcW w:w="2126" w:type="dxa"/>
+            <w:tcW w:w="1560" w:type="dxa"/>
             <w:vAlign w:val="center"/>
           </w:tcPr>
           <w:p>
@@ -7671,7 +9160,7 @@
               <w:right w:w="150" w:type="dxa"/>
               <w:bottom w:w="100" w:type="dxa"/>
             </w:tcMar>
-            <w:tcW w:w="5698" w:type="dxa"/>
+            <w:tcW w:w="3200" w:type="dxa"/>
             <w:vAlign w:val="center"/>
           </w:tcPr>
           <w:p>
@@ -7705,6 +9194,49 @@
                 <w:sz w:val="24"/>
                 <w:szCs w:val="24"/>
               </w:rPr>
+            </w:r>
+          </w:p>
+        </w:tc>
+        <w:tc>
+          <w:tcPr>
+            <w:tcBorders>
+              <w:top w:val="single" w:color="000000" w:sz="4" w:space="0"/>
+              <w:left w:val="single" w:color="000000" w:sz="4" w:space="0"/>
+              <w:bottom w:val="single" w:color="000000" w:sz="4" w:space="0"/>
+              <w:right w:val="single" w:color="000000" w:sz="4" w:space="0"/>
+            </w:tcBorders>
+            <w:tcMar>
+              <w:left w:w="150" w:type="dxa"/>
+              <w:top w:w="100" w:type="dxa"/>
+              <w:right w:w="150" w:type="dxa"/>
+              <w:bottom w:w="100" w:type="dxa"/>
+            </w:tcMar>
+            <w:tcW w:w="2900" w:type="dxa"/>
+            <w:vAlign w:val="center"/>
+          </w:tcPr>
+          <w:p>
+            <w:pPr>
+              <w:pBdr/>
+              <w:spacing w:line="240" w:lineRule="auto"/>
+              <w:ind/>
+              <w:jc w:val="left"/>
+              <w:rPr>
+                <w:rFonts w:ascii="Times New Roman" w:hAnsi="Times New Roman" w:cs="Times New Roman"/>
+                <w:color w:val="auto"/>
+                <w:sz w:val="24"/>
+                <w:szCs w:val="24"/>
+              </w:rPr>
+            </w:pPr>
+            <w:r>
+              <w:rPr>
+                <w:rFonts w:ascii="Times New Roman" w:hAnsi="Times New Roman" w:eastAsia="Times New Roman" w:cs="Times New Roman"/>
+                <w:b w:val="0"/>
+                <w:bCs w:val="0"/>
+                <w:color w:val="auto"/>
+                <w:sz w:val="24"/>
+                <w:szCs w:val="24"/>
+              </w:rPr>
+              <w:t xml:space="preserve">Opcional (NULL)</w:t>
             </w:r>
           </w:p>
         </w:tc>
@@ -7725,7 +9257,7 @@
               <w:right w:w="150" w:type="dxa"/>
               <w:bottom w:w="100" w:type="dxa"/>
             </w:tcMar>
-            <w:tcW w:w="1536" w:type="dxa"/>
+            <w:tcW w:w="1700" w:type="dxa"/>
             <w:vAlign w:val="center"/>
           </w:tcPr>
           <w:p>
@@ -7776,7 +9308,7 @@
               <w:right w:w="150" w:type="dxa"/>
               <w:bottom w:w="100" w:type="dxa"/>
             </w:tcMar>
-            <w:tcW w:w="2126" w:type="dxa"/>
+            <w:tcW w:w="1560" w:type="dxa"/>
             <w:vAlign w:val="center"/>
           </w:tcPr>
           <w:p>
@@ -7827,7 +9359,7 @@
               <w:right w:w="150" w:type="dxa"/>
               <w:bottom w:w="100" w:type="dxa"/>
             </w:tcMar>
-            <w:tcW w:w="5698" w:type="dxa"/>
+            <w:tcW w:w="3200" w:type="dxa"/>
             <w:vAlign w:val="center"/>
           </w:tcPr>
           <w:p>
@@ -7861,6 +9393,49 @@
                 <w:sz w:val="24"/>
                 <w:szCs w:val="24"/>
               </w:rPr>
+            </w:r>
+          </w:p>
+        </w:tc>
+        <w:tc>
+          <w:tcPr>
+            <w:tcBorders>
+              <w:top w:val="single" w:color="000000" w:sz="4" w:space="0"/>
+              <w:left w:val="single" w:color="000000" w:sz="4" w:space="0"/>
+              <w:bottom w:val="single" w:color="000000" w:sz="4" w:space="0"/>
+              <w:right w:val="single" w:color="000000" w:sz="4" w:space="0"/>
+            </w:tcBorders>
+            <w:tcMar>
+              <w:left w:w="150" w:type="dxa"/>
+              <w:top w:w="100" w:type="dxa"/>
+              <w:right w:w="150" w:type="dxa"/>
+              <w:bottom w:w="100" w:type="dxa"/>
+            </w:tcMar>
+            <w:tcW w:w="2900" w:type="dxa"/>
+            <w:vAlign w:val="center"/>
+          </w:tcPr>
+          <w:p>
+            <w:pPr>
+              <w:pBdr/>
+              <w:spacing w:line="240" w:lineRule="auto"/>
+              <w:ind/>
+              <w:jc w:val="left"/>
+              <w:rPr>
+                <w:rFonts w:ascii="Times New Roman" w:hAnsi="Times New Roman" w:cs="Times New Roman"/>
+                <w:color w:val="auto"/>
+                <w:sz w:val="24"/>
+                <w:szCs w:val="24"/>
+              </w:rPr>
+            </w:pPr>
+            <w:r>
+              <w:rPr>
+                <w:rFonts w:ascii="Times New Roman" w:hAnsi="Times New Roman" w:eastAsia="Times New Roman" w:cs="Times New Roman"/>
+                <w:b w:val="0"/>
+                <w:bCs w:val="0"/>
+                <w:color w:val="auto"/>
+                <w:sz w:val="24"/>
+                <w:szCs w:val="24"/>
+              </w:rPr>
+              <w:t xml:space="preserve">NOT NULL, CHECK (costo &gt;= 0)</w:t>
             </w:r>
           </w:p>
         </w:tc>
@@ -7882,17 +9457,6 @@
           <w:highlight w:val="none"/>
         </w:rPr>
       </w:pPr>
-      <w:r>
-        <w:rPr>
-          <w:rFonts w:ascii="Times New Roman" w:hAnsi="Times New Roman" w:eastAsia="Times New Roman" w:cs="Times New Roman"/>
-          <w:b/>
-          <w:bCs/>
-          <w:color w:val="auto"/>
-          <w:sz w:val="24"/>
-          <w:szCs w:val="24"/>
-          <w:highlight w:val="none"/>
-        </w:rPr>
-      </w:r>
       <w:r>
         <w:rPr>
           <w:rFonts w:ascii="Times New Roman" w:hAnsi="Times New Roman" w:eastAsia="Times New Roman" w:cs="Times New Roman"/>
@@ -8000,9 +9564,10 @@
         <w:tblLook w:val="04A0" w:firstRow="1" w:lastRow="0" w:firstColumn="1" w:lastColumn="0" w:noHBand="0" w:noVBand="1"/>
       </w:tblPr>
       <w:tblGrid>
-        <w:gridCol w:w="1536"/>
-        <w:gridCol w:w="1701"/>
-        <w:gridCol w:w="6123"/>
+        <w:gridCol w:w="1700"/>
+        <w:gridCol w:w="1560"/>
+        <w:gridCol w:w="3200"/>
+        <w:gridCol w:w="2900"/>
       </w:tblGrid>
       <w:tr>
         <w:trPr>
@@ -8022,7 +9587,7 @@
               <w:right w:w="150" w:type="dxa"/>
               <w:bottom w:w="100" w:type="dxa"/>
             </w:tcMar>
-            <w:tcW w:w="1536" w:type="dxa"/>
+            <w:tcW w:w="1700" w:type="dxa"/>
             <w:vAlign w:val="center"/>
           </w:tcPr>
           <w:p>
@@ -8073,7 +9638,7 @@
               <w:right w:w="150" w:type="dxa"/>
               <w:bottom w:w="100" w:type="dxa"/>
             </w:tcMar>
-            <w:tcW w:w="1701" w:type="dxa"/>
+            <w:tcW w:w="1560" w:type="dxa"/>
             <w:vAlign w:val="center"/>
           </w:tcPr>
           <w:p>
@@ -8124,7 +9689,7 @@
               <w:right w:w="150" w:type="dxa"/>
               <w:bottom w:w="100" w:type="dxa"/>
             </w:tcMar>
-            <w:tcW w:w="6123" w:type="dxa"/>
+            <w:tcW w:w="3200" w:type="dxa"/>
             <w:vAlign w:val="center"/>
           </w:tcPr>
           <w:p>
@@ -8158,6 +9723,49 @@
                 <w:sz w:val="24"/>
                 <w:szCs w:val="24"/>
               </w:rPr>
+            </w:r>
+          </w:p>
+        </w:tc>
+        <w:tc>
+          <w:tcPr>
+            <w:tcBorders>
+              <w:top w:val="single" w:color="000000" w:sz="4" w:space="0"/>
+              <w:left w:val="single" w:color="000000" w:sz="4" w:space="0"/>
+              <w:bottom w:val="single" w:color="000000" w:sz="4" w:space="0"/>
+              <w:right w:val="single" w:color="000000" w:sz="4" w:space="0"/>
+            </w:tcBorders>
+            <w:tcMar>
+              <w:left w:w="150" w:type="dxa"/>
+              <w:top w:w="100" w:type="dxa"/>
+              <w:right w:w="150" w:type="dxa"/>
+              <w:bottom w:w="100" w:type="dxa"/>
+            </w:tcMar>
+            <w:tcW w:w="2900" w:type="dxa"/>
+            <w:vAlign w:val="center"/>
+          </w:tcPr>
+          <w:p>
+            <w:pPr>
+              <w:pBdr/>
+              <w:spacing w:line="240" w:lineRule="auto"/>
+              <w:ind/>
+              <w:jc w:val="center"/>
+              <w:rPr>
+                <w:rFonts w:ascii="Times New Roman" w:hAnsi="Times New Roman" w:cs="Times New Roman"/>
+                <w:color w:val="auto"/>
+                <w:sz w:val="24"/>
+                <w:szCs w:val="24"/>
+              </w:rPr>
+            </w:pPr>
+            <w:r>
+              <w:rPr>
+                <w:rFonts w:ascii="Times New Roman" w:hAnsi="Times New Roman" w:eastAsia="Times New Roman" w:cs="Times New Roman"/>
+                <w:b/>
+                <w:bCs/>
+                <w:color w:val="auto"/>
+                <w:sz w:val="24"/>
+                <w:szCs w:val="24"/>
+              </w:rPr>
+              <w:t xml:space="preserve">Restricciones</w:t>
             </w:r>
           </w:p>
         </w:tc>
@@ -8178,7 +9786,7 @@
               <w:right w:w="150" w:type="dxa"/>
               <w:bottom w:w="100" w:type="dxa"/>
             </w:tcMar>
-            <w:tcW w:w="1536" w:type="dxa"/>
+            <w:tcW w:w="1700" w:type="dxa"/>
             <w:vAlign w:val="center"/>
           </w:tcPr>
           <w:p>
@@ -8229,7 +9837,7 @@
               <w:right w:w="150" w:type="dxa"/>
               <w:bottom w:w="100" w:type="dxa"/>
             </w:tcMar>
-            <w:tcW w:w="1701" w:type="dxa"/>
+            <w:tcW w:w="1560" w:type="dxa"/>
             <w:vAlign w:val="center"/>
           </w:tcPr>
           <w:p>
@@ -8280,7 +9888,7 @@
               <w:right w:w="150" w:type="dxa"/>
               <w:bottom w:w="100" w:type="dxa"/>
             </w:tcMar>
-            <w:tcW w:w="6123" w:type="dxa"/>
+            <w:tcW w:w="3200" w:type="dxa"/>
             <w:vAlign w:val="center"/>
           </w:tcPr>
           <w:p>
@@ -8314,6 +9922,49 @@
                 <w:sz w:val="24"/>
                 <w:szCs w:val="24"/>
               </w:rPr>
+            </w:r>
+          </w:p>
+        </w:tc>
+        <w:tc>
+          <w:tcPr>
+            <w:tcBorders>
+              <w:top w:val="single" w:color="000000" w:sz="4" w:space="0"/>
+              <w:left w:val="single" w:color="000000" w:sz="4" w:space="0"/>
+              <w:bottom w:val="single" w:color="000000" w:sz="4" w:space="0"/>
+              <w:right w:val="single" w:color="000000" w:sz="4" w:space="0"/>
+            </w:tcBorders>
+            <w:tcMar>
+              <w:left w:w="150" w:type="dxa"/>
+              <w:top w:w="100" w:type="dxa"/>
+              <w:right w:w="150" w:type="dxa"/>
+              <w:bottom w:w="100" w:type="dxa"/>
+            </w:tcMar>
+            <w:tcW w:w="2900" w:type="dxa"/>
+            <w:vAlign w:val="center"/>
+          </w:tcPr>
+          <w:p>
+            <w:pPr>
+              <w:pBdr/>
+              <w:spacing w:line="240" w:lineRule="auto"/>
+              <w:ind/>
+              <w:jc w:val="left"/>
+              <w:rPr>
+                <w:rFonts w:ascii="Times New Roman" w:hAnsi="Times New Roman" w:cs="Times New Roman"/>
+                <w:color w:val="auto"/>
+                <w:sz w:val="24"/>
+                <w:szCs w:val="24"/>
+              </w:rPr>
+            </w:pPr>
+            <w:r>
+              <w:rPr>
+                <w:rFonts w:ascii="Times New Roman" w:hAnsi="Times New Roman" w:eastAsia="Times New Roman" w:cs="Times New Roman"/>
+                <w:b w:val="0"/>
+                <w:bCs w:val="0"/>
+                <w:color w:val="auto"/>
+                <w:sz w:val="24"/>
+                <w:szCs w:val="24"/>
+              </w:rPr>
+              <w:t xml:space="preserve">PRIMARY KEY, NOT NULL, AUTO_INCREMENT</w:t>
             </w:r>
           </w:p>
         </w:tc>
@@ -8334,7 +9985,7 @@
               <w:right w:w="150" w:type="dxa"/>
               <w:bottom w:w="100" w:type="dxa"/>
             </w:tcMar>
-            <w:tcW w:w="1536" w:type="dxa"/>
+            <w:tcW w:w="1700" w:type="dxa"/>
             <w:vAlign w:val="center"/>
           </w:tcPr>
           <w:p>
@@ -8385,7 +10036,7 @@
               <w:right w:w="150" w:type="dxa"/>
               <w:bottom w:w="100" w:type="dxa"/>
             </w:tcMar>
-            <w:tcW w:w="1701" w:type="dxa"/>
+            <w:tcW w:w="1560" w:type="dxa"/>
             <w:vAlign w:val="center"/>
           </w:tcPr>
           <w:p>
@@ -8436,7 +10087,7 @@
               <w:right w:w="150" w:type="dxa"/>
               <w:bottom w:w="100" w:type="dxa"/>
             </w:tcMar>
-            <w:tcW w:w="6123" w:type="dxa"/>
+            <w:tcW w:w="3200" w:type="dxa"/>
             <w:vAlign w:val="center"/>
           </w:tcPr>
           <w:p>
@@ -8470,6 +10121,49 @@
                 <w:sz w:val="24"/>
                 <w:szCs w:val="24"/>
               </w:rPr>
+            </w:r>
+          </w:p>
+        </w:tc>
+        <w:tc>
+          <w:tcPr>
+            <w:tcBorders>
+              <w:top w:val="single" w:color="000000" w:sz="4" w:space="0"/>
+              <w:left w:val="single" w:color="000000" w:sz="4" w:space="0"/>
+              <w:bottom w:val="single" w:color="000000" w:sz="4" w:space="0"/>
+              <w:right w:val="single" w:color="000000" w:sz="4" w:space="0"/>
+            </w:tcBorders>
+            <w:tcMar>
+              <w:left w:w="150" w:type="dxa"/>
+              <w:top w:w="100" w:type="dxa"/>
+              <w:right w:w="150" w:type="dxa"/>
+              <w:bottom w:w="100" w:type="dxa"/>
+            </w:tcMar>
+            <w:tcW w:w="2900" w:type="dxa"/>
+            <w:vAlign w:val="center"/>
+          </w:tcPr>
+          <w:p>
+            <w:pPr>
+              <w:pBdr/>
+              <w:spacing w:line="240" w:lineRule="auto"/>
+              <w:ind/>
+              <w:jc w:val="left"/>
+              <w:rPr>
+                <w:rFonts w:ascii="Times New Roman" w:hAnsi="Times New Roman" w:cs="Times New Roman"/>
+                <w:color w:val="auto"/>
+                <w:sz w:val="24"/>
+                <w:szCs w:val="24"/>
+              </w:rPr>
+            </w:pPr>
+            <w:r>
+              <w:rPr>
+                <w:rFonts w:ascii="Times New Roman" w:hAnsi="Times New Roman" w:eastAsia="Times New Roman" w:cs="Times New Roman"/>
+                <w:b w:val="0"/>
+                <w:bCs w:val="0"/>
+                <w:color w:val="auto"/>
+                <w:sz w:val="24"/>
+                <w:szCs w:val="24"/>
+              </w:rPr>
+              <w:t xml:space="preserve">NOT NULL, FK → reserva(id_reserva), ON DELETE CASCADE, ON UPDATE CASCADE</w:t>
             </w:r>
           </w:p>
         </w:tc>
@@ -8490,7 +10184,7 @@
               <w:right w:w="150" w:type="dxa"/>
               <w:bottom w:w="100" w:type="dxa"/>
             </w:tcMar>
-            <w:tcW w:w="1536" w:type="dxa"/>
+            <w:tcW w:w="1700" w:type="dxa"/>
             <w:vAlign w:val="center"/>
           </w:tcPr>
           <w:p>
@@ -8541,7 +10235,7 @@
               <w:right w:w="150" w:type="dxa"/>
               <w:bottom w:w="100" w:type="dxa"/>
             </w:tcMar>
-            <w:tcW w:w="1701" w:type="dxa"/>
+            <w:tcW w:w="1560" w:type="dxa"/>
             <w:vAlign w:val="center"/>
           </w:tcPr>
           <w:p>
@@ -8592,7 +10286,7 @@
               <w:right w:w="150" w:type="dxa"/>
               <w:bottom w:w="100" w:type="dxa"/>
             </w:tcMar>
-            <w:tcW w:w="6123" w:type="dxa"/>
+            <w:tcW w:w="3200" w:type="dxa"/>
             <w:vAlign w:val="center"/>
           </w:tcPr>
           <w:p>
@@ -8626,6 +10320,49 @@
                 <w:sz w:val="24"/>
                 <w:szCs w:val="24"/>
               </w:rPr>
+            </w:r>
+          </w:p>
+        </w:tc>
+        <w:tc>
+          <w:tcPr>
+            <w:tcBorders>
+              <w:top w:val="single" w:color="000000" w:sz="4" w:space="0"/>
+              <w:left w:val="single" w:color="000000" w:sz="4" w:space="0"/>
+              <w:bottom w:val="single" w:color="000000" w:sz="4" w:space="0"/>
+              <w:right w:val="single" w:color="000000" w:sz="4" w:space="0"/>
+            </w:tcBorders>
+            <w:tcMar>
+              <w:left w:w="150" w:type="dxa"/>
+              <w:top w:w="100" w:type="dxa"/>
+              <w:right w:w="150" w:type="dxa"/>
+              <w:bottom w:w="100" w:type="dxa"/>
+            </w:tcMar>
+            <w:tcW w:w="2900" w:type="dxa"/>
+            <w:vAlign w:val="center"/>
+          </w:tcPr>
+          <w:p>
+            <w:pPr>
+              <w:pBdr/>
+              <w:spacing w:line="240" w:lineRule="auto"/>
+              <w:ind/>
+              <w:jc w:val="left"/>
+              <w:rPr>
+                <w:rFonts w:ascii="Times New Roman" w:hAnsi="Times New Roman" w:cs="Times New Roman"/>
+                <w:color w:val="auto"/>
+                <w:sz w:val="24"/>
+                <w:szCs w:val="24"/>
+              </w:rPr>
+            </w:pPr>
+            <w:r>
+              <w:rPr>
+                <w:rFonts w:ascii="Times New Roman" w:hAnsi="Times New Roman" w:eastAsia="Times New Roman" w:cs="Times New Roman"/>
+                <w:b w:val="0"/>
+                <w:bCs w:val="0"/>
+                <w:color w:val="auto"/>
+                <w:sz w:val="24"/>
+                <w:szCs w:val="24"/>
+              </w:rPr>
+              <w:t xml:space="preserve">NOT NULL, FK → servicio(id_servicio), ON DELETE RESTRICT, ON UPDATE CASCADE</w:t>
             </w:r>
           </w:p>
         </w:tc>
@@ -8646,7 +10383,7 @@
               <w:right w:w="150" w:type="dxa"/>
               <w:bottom w:w="100" w:type="dxa"/>
             </w:tcMar>
-            <w:tcW w:w="1536" w:type="dxa"/>
+            <w:tcW w:w="1700" w:type="dxa"/>
             <w:vAlign w:val="center"/>
           </w:tcPr>
           <w:p>
@@ -8697,7 +10434,7 @@
               <w:right w:w="150" w:type="dxa"/>
               <w:bottom w:w="100" w:type="dxa"/>
             </w:tcMar>
-            <w:tcW w:w="1701" w:type="dxa"/>
+            <w:tcW w:w="1560" w:type="dxa"/>
             <w:vAlign w:val="center"/>
           </w:tcPr>
           <w:p>
@@ -8748,7 +10485,7 @@
               <w:right w:w="150" w:type="dxa"/>
               <w:bottom w:w="100" w:type="dxa"/>
             </w:tcMar>
-            <w:tcW w:w="6123" w:type="dxa"/>
+            <w:tcW w:w="3200" w:type="dxa"/>
             <w:vAlign w:val="center"/>
           </w:tcPr>
           <w:p>
@@ -8785,6 +10522,49 @@
             </w:r>
           </w:p>
         </w:tc>
+        <w:tc>
+          <w:tcPr>
+            <w:tcBorders>
+              <w:top w:val="single" w:color="000000" w:sz="4" w:space="0"/>
+              <w:left w:val="single" w:color="000000" w:sz="4" w:space="0"/>
+              <w:bottom w:val="single" w:color="000000" w:sz="4" w:space="0"/>
+              <w:right w:val="single" w:color="000000" w:sz="4" w:space="0"/>
+            </w:tcBorders>
+            <w:tcMar>
+              <w:left w:w="150" w:type="dxa"/>
+              <w:top w:w="100" w:type="dxa"/>
+              <w:right w:w="150" w:type="dxa"/>
+              <w:bottom w:w="100" w:type="dxa"/>
+            </w:tcMar>
+            <w:tcW w:w="2900" w:type="dxa"/>
+            <w:vAlign w:val="center"/>
+          </w:tcPr>
+          <w:p>
+            <w:pPr>
+              <w:pBdr/>
+              <w:spacing w:line="240" w:lineRule="auto"/>
+              <w:ind/>
+              <w:jc w:val="left"/>
+              <w:rPr>
+                <w:rFonts w:ascii="Times New Roman" w:hAnsi="Times New Roman" w:cs="Times New Roman"/>
+                <w:color w:val="auto"/>
+                <w:sz w:val="24"/>
+                <w:szCs w:val="24"/>
+              </w:rPr>
+            </w:pPr>
+            <w:r>
+              <w:rPr>
+                <w:rFonts w:ascii="Times New Roman" w:hAnsi="Times New Roman" w:eastAsia="Times New Roman" w:cs="Times New Roman"/>
+                <w:b w:val="0"/>
+                <w:bCs w:val="0"/>
+                <w:color w:val="auto"/>
+                <w:sz w:val="24"/>
+                <w:szCs w:val="24"/>
+              </w:rPr>
+              <w:t xml:space="preserve">NOT NULL, DEFAULT CURRENT_TIMESTAMP</w:t>
+            </w:r>
+          </w:p>
+        </w:tc>
       </w:tr>
     </w:tbl>
     <w:p>
@@ -8799,14 +10579,6 @@
           <w:szCs w:val="24"/>
         </w:rPr>
       </w:pPr>
-      <w:r>
-        <w:rPr>
-          <w:rFonts w:ascii="Times New Roman" w:hAnsi="Times New Roman" w:eastAsia="Times New Roman" w:cs="Times New Roman"/>
-          <w:color w:val="auto"/>
-          <w:sz w:val="24"/>
-          <w:szCs w:val="24"/>
-        </w:rPr>
-      </w:r>
       <w:r>
         <w:rPr>
           <w:rFonts w:ascii="Times New Roman" w:hAnsi="Times New Roman" w:eastAsia="Times New Roman" w:cs="Times New Roman"/>
@@ -8851,15 +10623,6 @@
           <w:szCs w:val="24"/>
         </w:rPr>
         <w:t xml:space="preserve">. Relaciones entre Entidades</w:t>
-      </w:r>
-      <w:r>
-        <w:rPr>
-          <w:rFonts w:ascii="Times New Roman" w:hAnsi="Times New Roman" w:eastAsia="Times New Roman" w:cs="Times New Roman"/>
-          <w:b/>
-          <w:bCs/>
-          <w:sz w:val="24"/>
-          <w:szCs w:val="24"/>
-        </w:rPr>
       </w:r>
     </w:p>
     <w:p>

</xml_diff>